<commit_message>
Add constrained staffing modes and day/night regime support
Implements Gill-inspired fixed and day/night staffing constraints across
simulator, generator, and explorer. Day/Night regime toggle in the explorer
is now only visible when packs were generated in day_night mode. Generator
guards regime pack export to day_night mode only. Updated docs and manifold
packs for all modes.

Co-Authored-By: Claude Opus 4.6 <noreply@anthropic.com>
</commit_message>
<xml_diff>
--- a/Incident_Roster_Analysis.docx
+++ b/Incident_Roster_Analysis.docx
@@ -8,36 +8,11 @@
       </w:pPr>
       <w:r>
         <w:t>Documentation &amp; User Guide</w:t>
-      </w:r>
-      <w:r>
         <w:br/>
-      </w:r>
-      <w:r>
         <w:br/>
-      </w:r>
-      <w:r>
-        <w:t xml:space="preserve">Incident Pattern </w:t>
-      </w:r>
-      <w:r>
-        <w:t>Simulator</w:t>
-      </w:r>
-      <w:r>
-        <w:t xml:space="preserve"> </w:t>
-      </w:r>
-      <w:r>
+        <w:t xml:space="preserve">Incident Pattern Simulator </w:t>
         <w:br/>
-      </w:r>
-      <w:r>
-        <w:t xml:space="preserve">Incident </w:t>
-      </w:r>
-      <w:r>
-        <w:t xml:space="preserve">Overlap </w:t>
-      </w:r>
-      <w:r>
-        <w:t xml:space="preserve">3D </w:t>
-      </w:r>
-      <w:r>
-        <w:t>Explorer</w:t>
+        <w:t>Incident Overlap 3D Explorer</w:t>
       </w:r>
     </w:p>
     <w:p>
@@ -52,11 +27,6 @@
           <w:rStyle w:val="BookTitle"/>
         </w:rPr>
         <w:br/>
-      </w:r>
-      <w:r>
-        <w:rPr>
-          <w:rStyle w:val="BookTitle"/>
-        </w:rPr>
         <w:t>Beta Release</w:t>
       </w:r>
     </w:p>
@@ -230,11 +200,7 @@
       </w:pPr>
       <w:r>
         <w:fldChar w:fldCharType="begin"/>
-      </w:r>
-      <w:r>
         <w:instrText>TOC \o "1-2" \h \z \u</w:instrText>
-      </w:r>
-      <w:r>
         <w:fldChar w:fldCharType="separate"/>
       </w:r>
       <w:hyperlink w:anchor="_Toc219298625" w:history="1">
@@ -251,46 +217,10 @@
             <w:webHidden/>
           </w:rPr>
           <w:tab/>
-        </w:r>
-        <w:r>
-          <w:rPr>
-            <w:noProof/>
-            <w:webHidden/>
-          </w:rPr>
           <w:fldChar w:fldCharType="begin"/>
-        </w:r>
-        <w:r>
-          <w:rPr>
-            <w:noProof/>
-            <w:webHidden/>
-          </w:rPr>
           <w:instrText xml:space="preserve"> PAGEREF _Toc219298625 \h </w:instrText>
-        </w:r>
-        <w:r>
-          <w:rPr>
-            <w:noProof/>
-            <w:webHidden/>
-          </w:rPr>
-        </w:r>
-        <w:r>
-          <w:rPr>
-            <w:noProof/>
-            <w:webHidden/>
-          </w:rPr>
           <w:fldChar w:fldCharType="separate"/>
-        </w:r>
-        <w:r>
-          <w:rPr>
-            <w:noProof/>
-            <w:webHidden/>
-          </w:rPr>
           <w:t>3</w:t>
-        </w:r>
-        <w:r>
-          <w:rPr>
-            <w:noProof/>
-            <w:webHidden/>
-          </w:rPr>
           <w:fldChar w:fldCharType="end"/>
         </w:r>
       </w:hyperlink>
@@ -324,46 +254,10 @@
             <w:webHidden/>
           </w:rPr>
           <w:tab/>
-        </w:r>
-        <w:r>
-          <w:rPr>
-            <w:noProof/>
-            <w:webHidden/>
-          </w:rPr>
           <w:fldChar w:fldCharType="begin"/>
-        </w:r>
-        <w:r>
-          <w:rPr>
-            <w:noProof/>
-            <w:webHidden/>
-          </w:rPr>
           <w:instrText xml:space="preserve"> PAGEREF _Toc219298626 \h </w:instrText>
-        </w:r>
-        <w:r>
-          <w:rPr>
-            <w:noProof/>
-            <w:webHidden/>
-          </w:rPr>
-        </w:r>
-        <w:r>
-          <w:rPr>
-            <w:noProof/>
-            <w:webHidden/>
-          </w:rPr>
           <w:fldChar w:fldCharType="separate"/>
-        </w:r>
-        <w:r>
-          <w:rPr>
-            <w:noProof/>
-            <w:webHidden/>
-          </w:rPr>
           <w:t>3</w:t>
-        </w:r>
-        <w:r>
-          <w:rPr>
-            <w:noProof/>
-            <w:webHidden/>
-          </w:rPr>
           <w:fldChar w:fldCharType="end"/>
         </w:r>
       </w:hyperlink>
@@ -397,46 +291,10 @@
             <w:webHidden/>
           </w:rPr>
           <w:tab/>
-        </w:r>
-        <w:r>
-          <w:rPr>
-            <w:noProof/>
-            <w:webHidden/>
-          </w:rPr>
           <w:fldChar w:fldCharType="begin"/>
-        </w:r>
-        <w:r>
-          <w:rPr>
-            <w:noProof/>
-            <w:webHidden/>
-          </w:rPr>
           <w:instrText xml:space="preserve"> PAGEREF _Toc219298627 \h </w:instrText>
-        </w:r>
-        <w:r>
-          <w:rPr>
-            <w:noProof/>
-            <w:webHidden/>
-          </w:rPr>
-        </w:r>
-        <w:r>
-          <w:rPr>
-            <w:noProof/>
-            <w:webHidden/>
-          </w:rPr>
           <w:fldChar w:fldCharType="separate"/>
-        </w:r>
-        <w:r>
-          <w:rPr>
-            <w:noProof/>
-            <w:webHidden/>
-          </w:rPr>
           <w:t>3</w:t>
-        </w:r>
-        <w:r>
-          <w:rPr>
-            <w:noProof/>
-            <w:webHidden/>
-          </w:rPr>
           <w:fldChar w:fldCharType="end"/>
         </w:r>
       </w:hyperlink>
@@ -470,46 +328,10 @@
             <w:webHidden/>
           </w:rPr>
           <w:tab/>
-        </w:r>
-        <w:r>
-          <w:rPr>
-            <w:noProof/>
-            <w:webHidden/>
-          </w:rPr>
           <w:fldChar w:fldCharType="begin"/>
-        </w:r>
-        <w:r>
-          <w:rPr>
-            <w:noProof/>
-            <w:webHidden/>
-          </w:rPr>
           <w:instrText xml:space="preserve"> PAGEREF _Toc219298628 \h </w:instrText>
-        </w:r>
-        <w:r>
-          <w:rPr>
-            <w:noProof/>
-            <w:webHidden/>
-          </w:rPr>
-        </w:r>
-        <w:r>
-          <w:rPr>
-            <w:noProof/>
-            <w:webHidden/>
-          </w:rPr>
           <w:fldChar w:fldCharType="separate"/>
-        </w:r>
-        <w:r>
-          <w:rPr>
-            <w:noProof/>
-            <w:webHidden/>
-          </w:rPr>
           <w:t>3</w:t>
-        </w:r>
-        <w:r>
-          <w:rPr>
-            <w:noProof/>
-            <w:webHidden/>
-          </w:rPr>
           <w:fldChar w:fldCharType="end"/>
         </w:r>
       </w:hyperlink>
@@ -543,46 +365,10 @@
             <w:webHidden/>
           </w:rPr>
           <w:tab/>
-        </w:r>
-        <w:r>
-          <w:rPr>
-            <w:noProof/>
-            <w:webHidden/>
-          </w:rPr>
           <w:fldChar w:fldCharType="begin"/>
-        </w:r>
-        <w:r>
-          <w:rPr>
-            <w:noProof/>
-            <w:webHidden/>
-          </w:rPr>
           <w:instrText xml:space="preserve"> PAGEREF _Toc219298629 \h </w:instrText>
-        </w:r>
-        <w:r>
-          <w:rPr>
-            <w:noProof/>
-            <w:webHidden/>
-          </w:rPr>
-        </w:r>
-        <w:r>
-          <w:rPr>
-            <w:noProof/>
-            <w:webHidden/>
-          </w:rPr>
           <w:fldChar w:fldCharType="separate"/>
-        </w:r>
-        <w:r>
-          <w:rPr>
-            <w:noProof/>
-            <w:webHidden/>
-          </w:rPr>
           <w:t>4</w:t>
-        </w:r>
-        <w:r>
-          <w:rPr>
-            <w:noProof/>
-            <w:webHidden/>
-          </w:rPr>
           <w:fldChar w:fldCharType="end"/>
         </w:r>
       </w:hyperlink>
@@ -616,46 +402,10 @@
             <w:webHidden/>
           </w:rPr>
           <w:tab/>
-        </w:r>
-        <w:r>
-          <w:rPr>
-            <w:noProof/>
-            <w:webHidden/>
-          </w:rPr>
           <w:fldChar w:fldCharType="begin"/>
-        </w:r>
-        <w:r>
-          <w:rPr>
-            <w:noProof/>
-            <w:webHidden/>
-          </w:rPr>
           <w:instrText xml:space="preserve"> PAGEREF _Toc219298630 \h </w:instrText>
-        </w:r>
-        <w:r>
-          <w:rPr>
-            <w:noProof/>
-            <w:webHidden/>
-          </w:rPr>
-        </w:r>
-        <w:r>
-          <w:rPr>
-            <w:noProof/>
-            <w:webHidden/>
-          </w:rPr>
           <w:fldChar w:fldCharType="separate"/>
-        </w:r>
-        <w:r>
-          <w:rPr>
-            <w:noProof/>
-            <w:webHidden/>
-          </w:rPr>
           <w:t>4</w:t>
-        </w:r>
-        <w:r>
-          <w:rPr>
-            <w:noProof/>
-            <w:webHidden/>
-          </w:rPr>
           <w:fldChar w:fldCharType="end"/>
         </w:r>
       </w:hyperlink>
@@ -689,46 +439,10 @@
             <w:webHidden/>
           </w:rPr>
           <w:tab/>
-        </w:r>
-        <w:r>
-          <w:rPr>
-            <w:noProof/>
-            <w:webHidden/>
-          </w:rPr>
           <w:fldChar w:fldCharType="begin"/>
-        </w:r>
-        <w:r>
-          <w:rPr>
-            <w:noProof/>
-            <w:webHidden/>
-          </w:rPr>
           <w:instrText xml:space="preserve"> PAGEREF _Toc219298631 \h </w:instrText>
-        </w:r>
-        <w:r>
-          <w:rPr>
-            <w:noProof/>
-            <w:webHidden/>
-          </w:rPr>
-        </w:r>
-        <w:r>
-          <w:rPr>
-            <w:noProof/>
-            <w:webHidden/>
-          </w:rPr>
           <w:fldChar w:fldCharType="separate"/>
-        </w:r>
-        <w:r>
-          <w:rPr>
-            <w:noProof/>
-            <w:webHidden/>
-          </w:rPr>
           <w:t>4</w:t>
-        </w:r>
-        <w:r>
-          <w:rPr>
-            <w:noProof/>
-            <w:webHidden/>
-          </w:rPr>
           <w:fldChar w:fldCharType="end"/>
         </w:r>
       </w:hyperlink>
@@ -762,46 +476,10 @@
             <w:webHidden/>
           </w:rPr>
           <w:tab/>
-        </w:r>
-        <w:r>
-          <w:rPr>
-            <w:noProof/>
-            <w:webHidden/>
-          </w:rPr>
           <w:fldChar w:fldCharType="begin"/>
-        </w:r>
-        <w:r>
-          <w:rPr>
-            <w:noProof/>
-            <w:webHidden/>
-          </w:rPr>
           <w:instrText xml:space="preserve"> PAGEREF _Toc219298632 \h </w:instrText>
-        </w:r>
-        <w:r>
-          <w:rPr>
-            <w:noProof/>
-            <w:webHidden/>
-          </w:rPr>
-        </w:r>
-        <w:r>
-          <w:rPr>
-            <w:noProof/>
-            <w:webHidden/>
-          </w:rPr>
           <w:fldChar w:fldCharType="separate"/>
-        </w:r>
-        <w:r>
-          <w:rPr>
-            <w:noProof/>
-            <w:webHidden/>
-          </w:rPr>
           <w:t>5</w:t>
-        </w:r>
-        <w:r>
-          <w:rPr>
-            <w:noProof/>
-            <w:webHidden/>
-          </w:rPr>
           <w:fldChar w:fldCharType="end"/>
         </w:r>
       </w:hyperlink>
@@ -835,46 +513,10 @@
             <w:webHidden/>
           </w:rPr>
           <w:tab/>
-        </w:r>
-        <w:r>
-          <w:rPr>
-            <w:noProof/>
-            <w:webHidden/>
-          </w:rPr>
           <w:fldChar w:fldCharType="begin"/>
-        </w:r>
-        <w:r>
-          <w:rPr>
-            <w:noProof/>
-            <w:webHidden/>
-          </w:rPr>
           <w:instrText xml:space="preserve"> PAGEREF _Toc219298633 \h </w:instrText>
-        </w:r>
-        <w:r>
-          <w:rPr>
-            <w:noProof/>
-            <w:webHidden/>
-          </w:rPr>
-        </w:r>
-        <w:r>
-          <w:rPr>
-            <w:noProof/>
-            <w:webHidden/>
-          </w:rPr>
           <w:fldChar w:fldCharType="separate"/>
-        </w:r>
-        <w:r>
-          <w:rPr>
-            <w:noProof/>
-            <w:webHidden/>
-          </w:rPr>
           <w:t>6</w:t>
-        </w:r>
-        <w:r>
-          <w:rPr>
-            <w:noProof/>
-            <w:webHidden/>
-          </w:rPr>
           <w:fldChar w:fldCharType="end"/>
         </w:r>
       </w:hyperlink>
@@ -908,46 +550,10 @@
             <w:webHidden/>
           </w:rPr>
           <w:tab/>
-        </w:r>
-        <w:r>
-          <w:rPr>
-            <w:noProof/>
-            <w:webHidden/>
-          </w:rPr>
           <w:fldChar w:fldCharType="begin"/>
-        </w:r>
-        <w:r>
-          <w:rPr>
-            <w:noProof/>
-            <w:webHidden/>
-          </w:rPr>
           <w:instrText xml:space="preserve"> PAGEREF _Toc219298634 \h </w:instrText>
-        </w:r>
-        <w:r>
-          <w:rPr>
-            <w:noProof/>
-            <w:webHidden/>
-          </w:rPr>
-        </w:r>
-        <w:r>
-          <w:rPr>
-            <w:noProof/>
-            <w:webHidden/>
-          </w:rPr>
           <w:fldChar w:fldCharType="separate"/>
-        </w:r>
-        <w:r>
-          <w:rPr>
-            <w:noProof/>
-            <w:webHidden/>
-          </w:rPr>
           <w:t>6</w:t>
-        </w:r>
-        <w:r>
-          <w:rPr>
-            <w:noProof/>
-            <w:webHidden/>
-          </w:rPr>
           <w:fldChar w:fldCharType="end"/>
         </w:r>
       </w:hyperlink>
@@ -981,46 +587,10 @@
             <w:webHidden/>
           </w:rPr>
           <w:tab/>
-        </w:r>
-        <w:r>
-          <w:rPr>
-            <w:noProof/>
-            <w:webHidden/>
-          </w:rPr>
           <w:fldChar w:fldCharType="begin"/>
-        </w:r>
-        <w:r>
-          <w:rPr>
-            <w:noProof/>
-            <w:webHidden/>
-          </w:rPr>
           <w:instrText xml:space="preserve"> PAGEREF _Toc219298635 \h </w:instrText>
-        </w:r>
-        <w:r>
-          <w:rPr>
-            <w:noProof/>
-            <w:webHidden/>
-          </w:rPr>
-        </w:r>
-        <w:r>
-          <w:rPr>
-            <w:noProof/>
-            <w:webHidden/>
-          </w:rPr>
           <w:fldChar w:fldCharType="separate"/>
-        </w:r>
-        <w:r>
-          <w:rPr>
-            <w:noProof/>
-            <w:webHidden/>
-          </w:rPr>
           <w:t>7</w:t>
-        </w:r>
-        <w:r>
-          <w:rPr>
-            <w:noProof/>
-            <w:webHidden/>
-          </w:rPr>
           <w:fldChar w:fldCharType="end"/>
         </w:r>
       </w:hyperlink>
@@ -1054,46 +624,10 @@
             <w:webHidden/>
           </w:rPr>
           <w:tab/>
-        </w:r>
-        <w:r>
-          <w:rPr>
-            <w:noProof/>
-            <w:webHidden/>
-          </w:rPr>
           <w:fldChar w:fldCharType="begin"/>
-        </w:r>
-        <w:r>
-          <w:rPr>
-            <w:noProof/>
-            <w:webHidden/>
-          </w:rPr>
           <w:instrText xml:space="preserve"> PAGEREF _Toc219298636 \h </w:instrText>
-        </w:r>
-        <w:r>
-          <w:rPr>
-            <w:noProof/>
-            <w:webHidden/>
-          </w:rPr>
-        </w:r>
-        <w:r>
-          <w:rPr>
-            <w:noProof/>
-            <w:webHidden/>
-          </w:rPr>
           <w:fldChar w:fldCharType="separate"/>
-        </w:r>
-        <w:r>
-          <w:rPr>
-            <w:noProof/>
-            <w:webHidden/>
-          </w:rPr>
           <w:t>7</w:t>
-        </w:r>
-        <w:r>
-          <w:rPr>
-            <w:noProof/>
-            <w:webHidden/>
-          </w:rPr>
           <w:fldChar w:fldCharType="end"/>
         </w:r>
       </w:hyperlink>
@@ -1127,46 +661,10 @@
             <w:webHidden/>
           </w:rPr>
           <w:tab/>
-        </w:r>
-        <w:r>
-          <w:rPr>
-            <w:noProof/>
-            <w:webHidden/>
-          </w:rPr>
           <w:fldChar w:fldCharType="begin"/>
-        </w:r>
-        <w:r>
-          <w:rPr>
-            <w:noProof/>
-            <w:webHidden/>
-          </w:rPr>
           <w:instrText xml:space="preserve"> PAGEREF _Toc219298637 \h </w:instrText>
-        </w:r>
-        <w:r>
-          <w:rPr>
-            <w:noProof/>
-            <w:webHidden/>
-          </w:rPr>
-        </w:r>
-        <w:r>
-          <w:rPr>
-            <w:noProof/>
-            <w:webHidden/>
-          </w:rPr>
           <w:fldChar w:fldCharType="separate"/>
-        </w:r>
-        <w:r>
-          <w:rPr>
-            <w:noProof/>
-            <w:webHidden/>
-          </w:rPr>
           <w:t>8</w:t>
-        </w:r>
-        <w:r>
-          <w:rPr>
-            <w:noProof/>
-            <w:webHidden/>
-          </w:rPr>
           <w:fldChar w:fldCharType="end"/>
         </w:r>
       </w:hyperlink>
@@ -1200,46 +698,10 @@
             <w:webHidden/>
           </w:rPr>
           <w:tab/>
-        </w:r>
-        <w:r>
-          <w:rPr>
-            <w:noProof/>
-            <w:webHidden/>
-          </w:rPr>
           <w:fldChar w:fldCharType="begin"/>
-        </w:r>
-        <w:r>
-          <w:rPr>
-            <w:noProof/>
-            <w:webHidden/>
-          </w:rPr>
           <w:instrText xml:space="preserve"> PAGEREF _Toc219298638 \h </w:instrText>
-        </w:r>
-        <w:r>
-          <w:rPr>
-            <w:noProof/>
-            <w:webHidden/>
-          </w:rPr>
-        </w:r>
-        <w:r>
-          <w:rPr>
-            <w:noProof/>
-            <w:webHidden/>
-          </w:rPr>
           <w:fldChar w:fldCharType="separate"/>
-        </w:r>
-        <w:r>
-          <w:rPr>
-            <w:noProof/>
-            <w:webHidden/>
-          </w:rPr>
           <w:t>9</w:t>
-        </w:r>
-        <w:r>
-          <w:rPr>
-            <w:noProof/>
-            <w:webHidden/>
-          </w:rPr>
           <w:fldChar w:fldCharType="end"/>
         </w:r>
       </w:hyperlink>
@@ -1273,46 +735,10 @@
             <w:webHidden/>
           </w:rPr>
           <w:tab/>
-        </w:r>
-        <w:r>
-          <w:rPr>
-            <w:noProof/>
-            <w:webHidden/>
-          </w:rPr>
           <w:fldChar w:fldCharType="begin"/>
-        </w:r>
-        <w:r>
-          <w:rPr>
-            <w:noProof/>
-            <w:webHidden/>
-          </w:rPr>
           <w:instrText xml:space="preserve"> PAGEREF _Toc219298639 \h </w:instrText>
-        </w:r>
-        <w:r>
-          <w:rPr>
-            <w:noProof/>
-            <w:webHidden/>
-          </w:rPr>
-        </w:r>
-        <w:r>
-          <w:rPr>
-            <w:noProof/>
-            <w:webHidden/>
-          </w:rPr>
           <w:fldChar w:fldCharType="separate"/>
-        </w:r>
-        <w:r>
-          <w:rPr>
-            <w:noProof/>
-            <w:webHidden/>
-          </w:rPr>
           <w:t>9</w:t>
-        </w:r>
-        <w:r>
-          <w:rPr>
-            <w:noProof/>
-            <w:webHidden/>
-          </w:rPr>
           <w:fldChar w:fldCharType="end"/>
         </w:r>
       </w:hyperlink>
@@ -1346,46 +772,10 @@
             <w:webHidden/>
           </w:rPr>
           <w:tab/>
-        </w:r>
-        <w:r>
-          <w:rPr>
-            <w:noProof/>
-            <w:webHidden/>
-          </w:rPr>
           <w:fldChar w:fldCharType="begin"/>
-        </w:r>
-        <w:r>
-          <w:rPr>
-            <w:noProof/>
-            <w:webHidden/>
-          </w:rPr>
           <w:instrText xml:space="preserve"> PAGEREF _Toc219298640 \h </w:instrText>
-        </w:r>
-        <w:r>
-          <w:rPr>
-            <w:noProof/>
-            <w:webHidden/>
-          </w:rPr>
-        </w:r>
-        <w:r>
-          <w:rPr>
-            <w:noProof/>
-            <w:webHidden/>
-          </w:rPr>
           <w:fldChar w:fldCharType="separate"/>
-        </w:r>
-        <w:r>
-          <w:rPr>
-            <w:noProof/>
-            <w:webHidden/>
-          </w:rPr>
           <w:t>9</w:t>
-        </w:r>
-        <w:r>
-          <w:rPr>
-            <w:noProof/>
-            <w:webHidden/>
-          </w:rPr>
           <w:fldChar w:fldCharType="end"/>
         </w:r>
       </w:hyperlink>
@@ -1419,46 +809,10 @@
             <w:webHidden/>
           </w:rPr>
           <w:tab/>
-        </w:r>
-        <w:r>
-          <w:rPr>
-            <w:noProof/>
-            <w:webHidden/>
-          </w:rPr>
           <w:fldChar w:fldCharType="begin"/>
-        </w:r>
-        <w:r>
-          <w:rPr>
-            <w:noProof/>
-            <w:webHidden/>
-          </w:rPr>
           <w:instrText xml:space="preserve"> PAGEREF _Toc219298641 \h </w:instrText>
-        </w:r>
-        <w:r>
-          <w:rPr>
-            <w:noProof/>
-            <w:webHidden/>
-          </w:rPr>
-        </w:r>
-        <w:r>
-          <w:rPr>
-            <w:noProof/>
-            <w:webHidden/>
-          </w:rPr>
           <w:fldChar w:fldCharType="separate"/>
-        </w:r>
-        <w:r>
-          <w:rPr>
-            <w:noProof/>
-            <w:webHidden/>
-          </w:rPr>
           <w:t>9</w:t>
-        </w:r>
-        <w:r>
-          <w:rPr>
-            <w:noProof/>
-            <w:webHidden/>
-          </w:rPr>
           <w:fldChar w:fldCharType="end"/>
         </w:r>
       </w:hyperlink>
@@ -1492,46 +846,10 @@
             <w:webHidden/>
           </w:rPr>
           <w:tab/>
-        </w:r>
-        <w:r>
-          <w:rPr>
-            <w:noProof/>
-            <w:webHidden/>
-          </w:rPr>
           <w:fldChar w:fldCharType="begin"/>
-        </w:r>
-        <w:r>
-          <w:rPr>
-            <w:noProof/>
-            <w:webHidden/>
-          </w:rPr>
           <w:instrText xml:space="preserve"> PAGEREF _Toc219298642 \h </w:instrText>
-        </w:r>
-        <w:r>
-          <w:rPr>
-            <w:noProof/>
-            <w:webHidden/>
-          </w:rPr>
-        </w:r>
-        <w:r>
-          <w:rPr>
-            <w:noProof/>
-            <w:webHidden/>
-          </w:rPr>
           <w:fldChar w:fldCharType="separate"/>
-        </w:r>
-        <w:r>
-          <w:rPr>
-            <w:noProof/>
-            <w:webHidden/>
-          </w:rPr>
           <w:t>10</w:t>
-        </w:r>
-        <w:r>
-          <w:rPr>
-            <w:noProof/>
-            <w:webHidden/>
-          </w:rPr>
           <w:fldChar w:fldCharType="end"/>
         </w:r>
       </w:hyperlink>
@@ -1565,46 +883,10 @@
             <w:webHidden/>
           </w:rPr>
           <w:tab/>
-        </w:r>
-        <w:r>
-          <w:rPr>
-            <w:noProof/>
-            <w:webHidden/>
-          </w:rPr>
           <w:fldChar w:fldCharType="begin"/>
-        </w:r>
-        <w:r>
-          <w:rPr>
-            <w:noProof/>
-            <w:webHidden/>
-          </w:rPr>
           <w:instrText xml:space="preserve"> PAGEREF _Toc219298643 \h </w:instrText>
-        </w:r>
-        <w:r>
-          <w:rPr>
-            <w:noProof/>
-            <w:webHidden/>
-          </w:rPr>
-        </w:r>
-        <w:r>
-          <w:rPr>
-            <w:noProof/>
-            <w:webHidden/>
-          </w:rPr>
           <w:fldChar w:fldCharType="separate"/>
-        </w:r>
-        <w:r>
-          <w:rPr>
-            <w:noProof/>
-            <w:webHidden/>
-          </w:rPr>
           <w:t>10</w:t>
-        </w:r>
-        <w:r>
-          <w:rPr>
-            <w:noProof/>
-            <w:webHidden/>
-          </w:rPr>
           <w:fldChar w:fldCharType="end"/>
         </w:r>
       </w:hyperlink>
@@ -1638,46 +920,10 @@
             <w:webHidden/>
           </w:rPr>
           <w:tab/>
-        </w:r>
-        <w:r>
-          <w:rPr>
-            <w:noProof/>
-            <w:webHidden/>
-          </w:rPr>
           <w:fldChar w:fldCharType="begin"/>
-        </w:r>
-        <w:r>
-          <w:rPr>
-            <w:noProof/>
-            <w:webHidden/>
-          </w:rPr>
           <w:instrText xml:space="preserve"> PAGEREF _Toc219298644 \h </w:instrText>
-        </w:r>
-        <w:r>
-          <w:rPr>
-            <w:noProof/>
-            <w:webHidden/>
-          </w:rPr>
-        </w:r>
-        <w:r>
-          <w:rPr>
-            <w:noProof/>
-            <w:webHidden/>
-          </w:rPr>
           <w:fldChar w:fldCharType="separate"/>
-        </w:r>
-        <w:r>
-          <w:rPr>
-            <w:noProof/>
-            <w:webHidden/>
-          </w:rPr>
           <w:t>10</w:t>
-        </w:r>
-        <w:r>
-          <w:rPr>
-            <w:noProof/>
-            <w:webHidden/>
-          </w:rPr>
           <w:fldChar w:fldCharType="end"/>
         </w:r>
       </w:hyperlink>
@@ -1711,46 +957,10 @@
             <w:webHidden/>
           </w:rPr>
           <w:tab/>
-        </w:r>
-        <w:r>
-          <w:rPr>
-            <w:noProof/>
-            <w:webHidden/>
-          </w:rPr>
           <w:fldChar w:fldCharType="begin"/>
-        </w:r>
-        <w:r>
-          <w:rPr>
-            <w:noProof/>
-            <w:webHidden/>
-          </w:rPr>
           <w:instrText xml:space="preserve"> PAGEREF _Toc219298645 \h </w:instrText>
-        </w:r>
-        <w:r>
-          <w:rPr>
-            <w:noProof/>
-            <w:webHidden/>
-          </w:rPr>
-        </w:r>
-        <w:r>
-          <w:rPr>
-            <w:noProof/>
-            <w:webHidden/>
-          </w:rPr>
           <w:fldChar w:fldCharType="separate"/>
-        </w:r>
-        <w:r>
-          <w:rPr>
-            <w:noProof/>
-            <w:webHidden/>
-          </w:rPr>
           <w:t>11</w:t>
-        </w:r>
-        <w:r>
-          <w:rPr>
-            <w:noProof/>
-            <w:webHidden/>
-          </w:rPr>
           <w:fldChar w:fldCharType="end"/>
         </w:r>
       </w:hyperlink>
@@ -1784,46 +994,10 @@
             <w:webHidden/>
           </w:rPr>
           <w:tab/>
-        </w:r>
-        <w:r>
-          <w:rPr>
-            <w:noProof/>
-            <w:webHidden/>
-          </w:rPr>
           <w:fldChar w:fldCharType="begin"/>
-        </w:r>
-        <w:r>
-          <w:rPr>
-            <w:noProof/>
-            <w:webHidden/>
-          </w:rPr>
           <w:instrText xml:space="preserve"> PAGEREF _Toc219298646 \h </w:instrText>
-        </w:r>
-        <w:r>
-          <w:rPr>
-            <w:noProof/>
-            <w:webHidden/>
-          </w:rPr>
-        </w:r>
-        <w:r>
-          <w:rPr>
-            <w:noProof/>
-            <w:webHidden/>
-          </w:rPr>
           <w:fldChar w:fldCharType="separate"/>
-        </w:r>
-        <w:r>
-          <w:rPr>
-            <w:noProof/>
-            <w:webHidden/>
-          </w:rPr>
           <w:t>12</w:t>
-        </w:r>
-        <w:r>
-          <w:rPr>
-            <w:noProof/>
-            <w:webHidden/>
-          </w:rPr>
           <w:fldChar w:fldCharType="end"/>
         </w:r>
       </w:hyperlink>
@@ -1857,46 +1031,10 @@
             <w:webHidden/>
           </w:rPr>
           <w:tab/>
-        </w:r>
-        <w:r>
-          <w:rPr>
-            <w:noProof/>
-            <w:webHidden/>
-          </w:rPr>
           <w:fldChar w:fldCharType="begin"/>
-        </w:r>
-        <w:r>
-          <w:rPr>
-            <w:noProof/>
-            <w:webHidden/>
-          </w:rPr>
           <w:instrText xml:space="preserve"> PAGEREF _Toc219298647 \h </w:instrText>
-        </w:r>
-        <w:r>
-          <w:rPr>
-            <w:noProof/>
-            <w:webHidden/>
-          </w:rPr>
-        </w:r>
-        <w:r>
-          <w:rPr>
-            <w:noProof/>
-            <w:webHidden/>
-          </w:rPr>
           <w:fldChar w:fldCharType="separate"/>
-        </w:r>
-        <w:r>
-          <w:rPr>
-            <w:noProof/>
-            <w:webHidden/>
-          </w:rPr>
           <w:t>12</w:t>
-        </w:r>
-        <w:r>
-          <w:rPr>
-            <w:noProof/>
-            <w:webHidden/>
-          </w:rPr>
           <w:fldChar w:fldCharType="end"/>
         </w:r>
       </w:hyperlink>
@@ -1930,46 +1068,10 @@
             <w:webHidden/>
           </w:rPr>
           <w:tab/>
-        </w:r>
-        <w:r>
-          <w:rPr>
-            <w:noProof/>
-            <w:webHidden/>
-          </w:rPr>
           <w:fldChar w:fldCharType="begin"/>
-        </w:r>
-        <w:r>
-          <w:rPr>
-            <w:noProof/>
-            <w:webHidden/>
-          </w:rPr>
           <w:instrText xml:space="preserve"> PAGEREF _Toc219298648 \h </w:instrText>
-        </w:r>
-        <w:r>
-          <w:rPr>
-            <w:noProof/>
-            <w:webHidden/>
-          </w:rPr>
-        </w:r>
-        <w:r>
-          <w:rPr>
-            <w:noProof/>
-            <w:webHidden/>
-          </w:rPr>
           <w:fldChar w:fldCharType="separate"/>
-        </w:r>
-        <w:r>
-          <w:rPr>
-            <w:noProof/>
-            <w:webHidden/>
-          </w:rPr>
           <w:t>13</w:t>
-        </w:r>
-        <w:r>
-          <w:rPr>
-            <w:noProof/>
-            <w:webHidden/>
-          </w:rPr>
           <w:fldChar w:fldCharType="end"/>
         </w:r>
       </w:hyperlink>
@@ -2003,46 +1105,10 @@
             <w:webHidden/>
           </w:rPr>
           <w:tab/>
-        </w:r>
-        <w:r>
-          <w:rPr>
-            <w:noProof/>
-            <w:webHidden/>
-          </w:rPr>
           <w:fldChar w:fldCharType="begin"/>
-        </w:r>
-        <w:r>
-          <w:rPr>
-            <w:noProof/>
-            <w:webHidden/>
-          </w:rPr>
           <w:instrText xml:space="preserve"> PAGEREF _Toc219298649 \h </w:instrText>
-        </w:r>
-        <w:r>
-          <w:rPr>
-            <w:noProof/>
-            <w:webHidden/>
-          </w:rPr>
-        </w:r>
-        <w:r>
-          <w:rPr>
-            <w:noProof/>
-            <w:webHidden/>
-          </w:rPr>
           <w:fldChar w:fldCharType="separate"/>
-        </w:r>
-        <w:r>
-          <w:rPr>
-            <w:noProof/>
-            <w:webHidden/>
-          </w:rPr>
           <w:t>14</w:t>
-        </w:r>
-        <w:r>
-          <w:rPr>
-            <w:noProof/>
-            <w:webHidden/>
-          </w:rPr>
           <w:fldChar w:fldCharType="end"/>
         </w:r>
       </w:hyperlink>
@@ -2076,46 +1142,10 @@
             <w:webHidden/>
           </w:rPr>
           <w:tab/>
-        </w:r>
-        <w:r>
-          <w:rPr>
-            <w:noProof/>
-            <w:webHidden/>
-          </w:rPr>
           <w:fldChar w:fldCharType="begin"/>
-        </w:r>
-        <w:r>
-          <w:rPr>
-            <w:noProof/>
-            <w:webHidden/>
-          </w:rPr>
           <w:instrText xml:space="preserve"> PAGEREF _Toc219298650 \h </w:instrText>
-        </w:r>
-        <w:r>
-          <w:rPr>
-            <w:noProof/>
-            <w:webHidden/>
-          </w:rPr>
-        </w:r>
-        <w:r>
-          <w:rPr>
-            <w:noProof/>
-            <w:webHidden/>
-          </w:rPr>
           <w:fldChar w:fldCharType="separate"/>
-        </w:r>
-        <w:r>
-          <w:rPr>
-            <w:noProof/>
-            <w:webHidden/>
-          </w:rPr>
           <w:t>14</w:t>
-        </w:r>
-        <w:r>
-          <w:rPr>
-            <w:noProof/>
-            <w:webHidden/>
-          </w:rPr>
           <w:fldChar w:fldCharType="end"/>
         </w:r>
       </w:hyperlink>
@@ -2149,46 +1179,10 @@
             <w:webHidden/>
           </w:rPr>
           <w:tab/>
-        </w:r>
-        <w:r>
-          <w:rPr>
-            <w:noProof/>
-            <w:webHidden/>
-          </w:rPr>
           <w:fldChar w:fldCharType="begin"/>
-        </w:r>
-        <w:r>
-          <w:rPr>
-            <w:noProof/>
-            <w:webHidden/>
-          </w:rPr>
           <w:instrText xml:space="preserve"> PAGEREF _Toc219298651 \h </w:instrText>
-        </w:r>
-        <w:r>
-          <w:rPr>
-            <w:noProof/>
-            <w:webHidden/>
-          </w:rPr>
-        </w:r>
-        <w:r>
-          <w:rPr>
-            <w:noProof/>
-            <w:webHidden/>
-          </w:rPr>
           <w:fldChar w:fldCharType="separate"/>
-        </w:r>
-        <w:r>
-          <w:rPr>
-            <w:noProof/>
-            <w:webHidden/>
-          </w:rPr>
           <w:t>14</w:t>
-        </w:r>
-        <w:r>
-          <w:rPr>
-            <w:noProof/>
-            <w:webHidden/>
-          </w:rPr>
           <w:fldChar w:fldCharType="end"/>
         </w:r>
       </w:hyperlink>
@@ -2222,46 +1216,10 @@
             <w:webHidden/>
           </w:rPr>
           <w:tab/>
-        </w:r>
-        <w:r>
-          <w:rPr>
-            <w:noProof/>
-            <w:webHidden/>
-          </w:rPr>
           <w:fldChar w:fldCharType="begin"/>
-        </w:r>
-        <w:r>
-          <w:rPr>
-            <w:noProof/>
-            <w:webHidden/>
-          </w:rPr>
           <w:instrText xml:space="preserve"> PAGEREF _Toc219298652 \h </w:instrText>
-        </w:r>
-        <w:r>
-          <w:rPr>
-            <w:noProof/>
-            <w:webHidden/>
-          </w:rPr>
-        </w:r>
-        <w:r>
-          <w:rPr>
-            <w:noProof/>
-            <w:webHidden/>
-          </w:rPr>
           <w:fldChar w:fldCharType="separate"/>
-        </w:r>
-        <w:r>
-          <w:rPr>
-            <w:noProof/>
-            <w:webHidden/>
-          </w:rPr>
           <w:t>14</w:t>
-        </w:r>
-        <w:r>
-          <w:rPr>
-            <w:noProof/>
-            <w:webHidden/>
-          </w:rPr>
           <w:fldChar w:fldCharType="end"/>
         </w:r>
       </w:hyperlink>
@@ -2352,17 +1310,7 @@
         <w:t>Requirement for Professional Oversight</w:t>
       </w:r>
       <w:r>
-        <w:t>. Any attempt to apply the statistical methodologies demonstrated here to live case data must be conducted, verified, and endorsed by a qualified expert witness—specifically, a Chartered Statistician (CStat, RSS), an Accredited Professional Statistician (</w:t>
-      </w:r>
-      <w:proofErr w:type="spellStart"/>
-      <w:r>
-        <w:t>PStat</w:t>
-      </w:r>
-      <w:proofErr w:type="spellEnd"/>
-      <w:r>
-        <w:t>, ASA), or an equivalent formally registered fellow of a recognised statistical body.</w:t>
-      </w:r>
-      <w:r>
+        <w:t>. Any attempt to apply the statistical methodologies demonstrated here to live case data must be conducted, verified, and endorsed by a qualified expert witness—specifically, a Chartered Statistician (CStat, RSS), an Accredited Professional Statistician (PStat, ASA), or an equivalent formally registered fellow of a recognised statistical body.</w:t>
         <w:br/>
       </w:r>
     </w:p>
@@ -2418,15 +1366,7 @@
         <w:t>Statistical framework</w:t>
       </w:r>
       <w:r>
-        <w:t xml:space="preserve">: The simulator implements a Monte Carlo approach to the hypergeometric distribution. Nurse shift counts are drawn from a Beta(α, β) distribution, </w:t>
-      </w:r>
-      <w:proofErr w:type="spellStart"/>
-      <w:r>
-        <w:t>reparameterised</w:t>
-      </w:r>
-      <w:proofErr w:type="spellEnd"/>
-      <w:r>
-        <w:t xml:space="preserve"> as Mean and Consistency for interpretability. Incident placements follow uniform random sampling without replacement. The null hypothesis is that overlap counts are explained entirely by workload (exposure), with no causal relationship to incident occurrence.</w:t>
+        <w:t>: The simulator implements a Monte Carlo approach to the hypergeometric distribution. Nurse shift counts are drawn from a Beta(α, β) distribution, reparameterised as Mean and Consistency for interpretability. Incident placements follow uniform random sampling without replacement. The null hypothesis is that overlap counts are explained entirely by workload (exposure), with no causal relationship to incident occurrence.</w:t>
       </w:r>
     </w:p>
     <w:p>
@@ -2467,11 +1407,7 @@
       </w:r>
       <w:r>
         <w:t xml:space="preserve"> (Incident_Pattern_Simulator.html): detailed, case-style assessment of a single nurse under adjustable assumptions.</w:t>
-      </w:r>
-      <w:r>
         <w:br/>
-      </w:r>
-      <w:r>
         <w:br/>
         <w:t xml:space="preserve">• </w:t>
       </w:r>
@@ -2480,39 +1416,10 @@
           <w:b/>
           <w:bCs/>
         </w:rPr>
-        <w:t xml:space="preserve">Incident </w:t>
-      </w:r>
-      <w:r>
-        <w:rPr>
-          <w:b/>
-          <w:bCs/>
-        </w:rPr>
-        <w:t xml:space="preserve">Overlap </w:t>
-      </w:r>
-      <w:r>
-        <w:rPr>
-          <w:b/>
-          <w:bCs/>
-        </w:rPr>
-        <w:t xml:space="preserve">3D </w:t>
-      </w:r>
-      <w:r>
-        <w:rPr>
-          <w:b/>
-          <w:bCs/>
-        </w:rPr>
-        <w:t>Explorer</w:t>
-      </w:r>
-      <w:r>
-        <w:t xml:space="preserve"> (incident_overlap_</w:t>
-      </w:r>
-      <w:r>
-        <w:t>3D_explorer</w:t>
-      </w:r>
-      <w:r>
-        <w:t>.html): rapid overview of expected maxima across incident count (M) and mean presence (p̄), showing Mean/Q95/Q99 surfaces.</w:t>
-      </w:r>
-      <w:r>
+        <w:t>Incident Overlap 3D Explorer</w:t>
+      </w:r>
+      <w:r>
+        <w:t xml:space="preserve"> (incident_overlap_3D_explorer.html): rapid overview of expected maxima across incident count (M) and mean presence (pÌ„), showing Mean/Q95/Q99 surfaces.</w:t>
         <w:br/>
       </w:r>
     </w:p>
@@ -2525,13 +1432,7 @@
         <w:t>Recommended workflow</w:t>
       </w:r>
       <w:r>
-        <w:t xml:space="preserve">: use the </w:t>
-      </w:r>
-      <w:r>
-        <w:t>Incident Overlap 3D Explorer</w:t>
-      </w:r>
-      <w:r>
-        <w:t xml:space="preserve"> to set statistical context (what maxima are typical vs elevated), then use the Pattern Simulator to examine the specific scenario of interest.</w:t>
+        <w:t>: use the Incident Overlap 3D Explorer to set statistical context (what maxima are typical vs elevated), then use the Pattern Simulator to examine the specific scenario of interest.</w:t>
       </w:r>
     </w:p>
     <w:p/>
@@ -2688,12 +1589,6 @@
           <w:iCs/>
         </w:rPr>
         <w:t xml:space="preserve">Addresses the multiple comparisons problem directly. Reports order statistics: median(max), P95(max), P99(max), and max(max) across trials. Demonstrates that the maximum of 38 </w:t>
-      </w:r>
-      <w:r>
-        <w:rPr>
-          <w:i/>
-          <w:iCs/>
-        </w:rPr>
         <w:lastRenderedPageBreak/>
         <w:t>exchangeable draws will naturally exceed individual expectations—this is not evidence of an anomaly.</w:t>
       </w:r>
@@ -2746,8 +1641,6 @@
       </w:r>
       <w:r>
         <w:t>Each nurse is assigned specific shift slots; incidents occupy specific slots; overlap = intersection. More realistic.</w:t>
-      </w:r>
-      <w:r>
         <w:br/>
       </w:r>
     </w:p>
@@ -2768,8 +1661,6 @@
       </w:r>
       <w:r>
         <w:t>Each incident is treated as an independent Bernoulli trial with P(overlap) = nurse's shift fraction. Faster but less precise.</w:t>
-      </w:r>
-      <w:r>
         <w:br/>
       </w:r>
     </w:p>
@@ -2789,8 +1680,6 @@
       <w:r>
         <w:br/>
         <w:t>Shift Count Logic</w:t>
-      </w:r>
-      <w:r>
         <w:br/>
       </w:r>
     </w:p>
@@ -2811,8 +1700,6 @@
       </w:r>
       <w:r>
         <w:t>Each nurse works exactly round(p × 730) shifts every trial. Conditions on observed workload.</w:t>
-      </w:r>
-      <w:r>
         <w:br/>
       </w:r>
     </w:p>
@@ -2846,71 +1733,13 @@
         <w:pStyle w:val="Heading3"/>
       </w:pPr>
       <w:r>
-        <w:t>RNG Seed</w:t>
-      </w:r>
-    </w:p>
-    <w:p>
-      <w:r>
-        <w:rPr>
-          <w:b/>
-          <w:bCs/>
-        </w:rPr>
-        <w:t>Controls reproducibility. Enter a number to get the same results every run. Leave blank for a fresh random seed on each run.</w:t>
-      </w:r>
-    </w:p>
-    <w:p>
-      <w:pPr>
-        <w:rPr>
-          <w:i/>
-          <w:iCs/>
-        </w:rPr>
-      </w:pPr>
-    </w:p>
-    <w:p>
-      <w:r>
-        <w:rPr>
-          <w:i/>
-          <w:iCs/>
-        </w:rPr>
-        <w:t>Uses the Mulberry32 PRNG seeded deterministically. Simulation outputs are reproducible given the same inputs and seed, supporting audit trails and peer review of statistical claims.</w:t>
-      </w:r>
-    </w:p>
-    <w:p>
-      <w:pPr>
-        <w:pStyle w:val="Heading2"/>
-      </w:pPr>
-      <w:bookmarkStart w:id="7" w:name="_Toc219298632"/>
-      <w:r>
-        <w:t>2.3 Ward Staffing Profile</w:t>
-      </w:r>
-      <w:bookmarkEnd w:id="7"/>
-    </w:p>
-    <w:p>
-      <w:r>
-        <w:t>This controls how varied nurses' hours are. Some wards have mostly full-time staff (uniform hours); others mix full-timers with casual/agency staff (varied hours).</w:t>
-      </w:r>
-    </w:p>
-    <w:p>
-      <w:pPr>
-        <w:rPr>
-          <w:b/>
-          <w:bCs/>
-          <w:color w:val="000000"/>
-          <w:sz w:val="24"/>
-          <w:szCs w:val="24"/>
-        </w:rPr>
-      </w:pPr>
-      <w:r>
-        <w:br w:type="page"/>
-      </w:r>
-    </w:p>
-    <w:p>
-      <w:pPr>
-        <w:pStyle w:val="Heading3"/>
-      </w:pPr>
-      <w:r>
-        <w:lastRenderedPageBreak/>
-        <w:t>Presets</w:t>
+        <w:br/>
+        <w:t>Staffing Constraint Mode</w:t>
+      </w:r>
+    </w:p>
+    <w:p>
+      <w:r>
+        <w:t>Real wards don’t randomly assign nurses — each shift has a roughly fixed headcount. This control models that constraint. “Day/Night Stratified” additionally captures the structural difference between day shifts (more staff) and night shifts (fewer staff), which produces a bimodal pattern in the roster data.</w:t>
       </w:r>
     </w:p>
     <w:p>
@@ -2921,30 +1750,15 @@
           <w:numId w:val="2"/>
         </w:numPr>
       </w:pPr>
-      <w:proofErr w:type="spellStart"/>
-      <w:r>
-        <w:rPr>
-          <w:b/>
-          <w:bCs/>
-        </w:rPr>
-        <w:t>O'Quigley</w:t>
-      </w:r>
-      <w:proofErr w:type="spellEnd"/>
-      <w:r>
-        <w:rPr>
-          <w:b/>
-          <w:bCs/>
-        </w:rPr>
-        <w:t xml:space="preserve"> (2025) Case Analysis: </w:t>
-      </w:r>
-      <w:r>
-        <w:t xml:space="preserve">Parameters (α=3.2, β=17.25) derived </w:t>
-      </w:r>
-      <w:r>
-        <w:t xml:space="preserve">from </w:t>
-      </w:r>
-      <w:r>
-        <w:t>'Use of roster charts in the investigation and prosecution of nurses suspected of inflicting deliberate harm on patients'.</w:t>
+      <w:r>
+        <w:rPr>
+          <w:b/>
+          <w:bCs/>
+        </w:rPr>
+        <w:t xml:space="preserve">Unconstrained (Independent): </w:t>
+      </w:r>
+      <w:r>
+        <w:t>Each nurse’s presence on each shift is an independent draw. This is the existing default behaviour, equivalent to the standard beta-binomial model.</w:t>
       </w:r>
     </w:p>
     <w:p>
@@ -2960,10 +1774,10 @@
           <w:b/>
           <w:bCs/>
         </w:rPr>
-        <w:t xml:space="preserve">Standard Core Team: </w:t>
-      </w:r>
-      <w:r>
-        <w:t>Mostly full-time staff with similar hours.</w:t>
+        <w:t xml:space="preserve">Fixed Shift Size: </w:t>
+      </w:r>
+      <w:r>
+        <w:t>Each shift draws exactly N nurses from the pool of 38, with probability proportional to each nurse’s overall workload weight. Nurses per shift is configurable (default 8).</w:t>
       </w:r>
     </w:p>
     <w:p>
@@ -2979,10 +1793,94 @@
           <w:b/>
           <w:bCs/>
         </w:rPr>
-        <w:t xml:space="preserve">Agency-Heavy: </w:t>
-      </w:r>
-      <w:r>
-        <w:t>Mix of permanent and casual staff; highly varied hours.</w:t>
+        <w:t xml:space="preserve">Day/Night Stratified: </w:t>
+      </w:r>
+      <w:r>
+        <w:t>Two regimes with separate fixed shift sizes. Day shifts draw more nurses (default 10), night shifts draw fewer (default 5). The day/night ratio controls the proportion of shifts that are day shifts (default 50%).</w:t>
+      </w:r>
+    </w:p>
+    <w:p/>
+    <w:p>
+      <w:r>
+        <w:rPr>
+          <w:i/>
+          <w:iCs/>
+        </w:rPr>
+        <w:t xml:space="preserve">Implements constrained sampling via weighted draws without replacement within each shift. Under “Fixed Shift Size”, each shift draws exactly N_shift nurses with probability proportional to relative workloads w_i (normalised Beta draws). Under “Day/Night Stratified”, shifts </w:t>
+        <w:lastRenderedPageBreak/>
+        <w:t>alternate between two regimes with distinct N_shift values. This replaces the independent-draws assumption of the beta-binomial with a model that respects the near-fixed row totals observed in real roster data (cf. Gill, 2026). The resulting overlap distribution has lower variance than the unconstrained model, as the fixed staffing constraint induces negative correlation between nurse presences within each shift. Column marginals (total shifts per nurse) are preserved in expectation but row totals (nurses per shift) are exactly constrained.</w:t>
+      </w:r>
+    </w:p>
+    <w:p>
+      <w:pPr>
+        <w:pStyle w:val="Heading3"/>
+      </w:pPr>
+      <w:r>
+        <w:t>RNG Seed</w:t>
+      </w:r>
+    </w:p>
+    <w:p>
+      <w:r>
+        <w:rPr>
+          <w:b/>
+          <w:bCs/>
+        </w:rPr>
+        <w:t>Controls reproducibility. Enter a number to get the same results every run. Leave blank for a fresh random seed on each run.</w:t>
+      </w:r>
+    </w:p>
+    <w:p>
+      <w:pPr>
+        <w:rPr>
+          <w:i/>
+          <w:iCs/>
+        </w:rPr>
+      </w:pPr>
+    </w:p>
+    <w:p>
+      <w:r>
+        <w:rPr>
+          <w:i/>
+          <w:iCs/>
+        </w:rPr>
+        <w:t>Uses the Mulberry32 PRNG seeded deterministically. Simulation outputs are reproducible given the same inputs and seed, supporting audit trails and peer review of statistical claims.</w:t>
+      </w:r>
+    </w:p>
+    <w:p>
+      <w:pPr>
+        <w:pStyle w:val="Heading2"/>
+      </w:pPr>
+      <w:bookmarkStart w:id="7" w:name="_Toc219298632"/>
+      <w:r>
+        <w:t>2.3 Ward Staffing Profile</w:t>
+      </w:r>
+      <w:bookmarkEnd w:id="7"/>
+    </w:p>
+    <w:p>
+      <w:r>
+        <w:t>This controls how varied nurses' hours are. Some wards have mostly full-time staff (uniform hours); others mix full-timers with casual/agency staff (varied hours).</w:t>
+      </w:r>
+    </w:p>
+    <w:p>
+      <w:pPr>
+        <w:rPr>
+          <w:b/>
+          <w:bCs/>
+          <w:color w:val="000000"/>
+          <w:sz w:val="24"/>
+          <w:szCs w:val="24"/>
+        </w:rPr>
+      </w:pPr>
+      <w:r>
+        <w:br w:type="page"/>
+      </w:r>
+    </w:p>
+    <w:p>
+      <w:pPr>
+        <w:pStyle w:val="Heading3"/>
+      </w:pPr>
+      <w:r>
+        <w:lastRenderedPageBreak/>
+        <w:t>Presets</w:t>
       </w:r>
     </w:p>
     <w:p>
@@ -2998,507 +1896,10 @@
           <w:b/>
           <w:bCs/>
         </w:rPr>
-        <w:t xml:space="preserve">High-Acuity Ward: </w:t>
-      </w:r>
-      <w:r>
-        <w:t>Specialist unit with experienced staff working longer hours.</w:t>
-      </w:r>
-    </w:p>
-    <w:p>
-      <w:pPr>
-        <w:pStyle w:val="Heading3"/>
-      </w:pPr>
-      <w:r>
-        <w:t>Mean Workload</w:t>
-      </w:r>
-    </w:p>
-    <w:p>
-      <w:r>
-        <w:t>The average proportion of shifts worked across all nurses. Higher = busier ward or more full-time staff.</w:t>
-      </w:r>
-      <w:r>
-        <w:br/>
-      </w:r>
-    </w:p>
-    <w:p>
-      <w:r>
-        <w:rPr>
-          <w:i/>
-          <w:iCs/>
-        </w:rPr>
-        <w:t>This is E[X] = α/(α+β) for the underlying Beta distribution. Directly interpretable as the expected shift fraction. Converted to estimated hours/week via: hours = mean × 14 slots/week × 12 hours/slot.</w:t>
-      </w:r>
-    </w:p>
-    <w:p>
-      <w:pPr>
-        <w:pStyle w:val="Heading3"/>
-      </w:pPr>
-      <w:r>
-        <w:t>Consistency</w:t>
-      </w:r>
-    </w:p>
-    <w:p>
-      <w:r>
-        <w:t>How similar are nurses' workloads? Higher = everyone works similar hours. Lower = wide variation between full-time and casual staff.</w:t>
-      </w:r>
-      <w:r>
-        <w:br/>
-      </w:r>
-    </w:p>
-    <w:p>
-      <w:r>
-        <w:rPr>
-          <w:i/>
-          <w:iCs/>
-        </w:rPr>
-        <w:t xml:space="preserve">This is the concentration parameter κ = α + β. Higher κ means lower variance: Var[X] = μ(1−μ)/(κ+1). </w:t>
-      </w:r>
-      <w:proofErr w:type="spellStart"/>
-      <w:r>
-        <w:rPr>
-          <w:i/>
-          <w:iCs/>
-        </w:rPr>
-        <w:t>Reparameterisation</w:t>
-      </w:r>
-      <w:proofErr w:type="spellEnd"/>
-      <w:r>
-        <w:rPr>
-          <w:i/>
-          <w:iCs/>
-        </w:rPr>
-        <w:t xml:space="preserve">: α = </w:t>
-      </w:r>
-      <w:proofErr w:type="spellStart"/>
-      <w:r>
-        <w:rPr>
-          <w:i/>
-          <w:iCs/>
-        </w:rPr>
-        <w:t>μκ</w:t>
-      </w:r>
-      <w:proofErr w:type="spellEnd"/>
-      <w:r>
-        <w:rPr>
-          <w:i/>
-          <w:iCs/>
-        </w:rPr>
-        <w:t>, β = (1−μ)κ. This Mean/Consistency form is more intuitive than raw α/β while remaining mathematically equivalent.</w:t>
-      </w:r>
-    </w:p>
-    <w:p>
-      <w:pPr>
-        <w:pStyle w:val="Heading2"/>
-      </w:pPr>
-      <w:bookmarkStart w:id="8" w:name="_Toc219298633"/>
-      <w:r>
-        <w:t>2.4 Suspect Nurse Exposure</w:t>
-      </w:r>
-      <w:bookmarkEnd w:id="8"/>
-    </w:p>
-    <w:p>
-      <w:pPr>
-        <w:pStyle w:val="Heading3"/>
-      </w:pPr>
-      <w:r>
-        <w:t>Suspect Presence Rate</w:t>
-      </w:r>
-    </w:p>
-    <w:p>
-      <w:r>
-        <w:t>The percentage of all shifts worked by the suspect nurse. This directly sets the suspect's exposure level. A nurse working 35% of all shifts (≈59 hours/week based on 12-hour shifts) will naturally be present at approximately 35% of randomly-distributed incidents—this is arithmetic, not suspicion.</w:t>
-      </w:r>
-      <w:r>
-        <w:br/>
-      </w:r>
-    </w:p>
-    <w:p>
-      <w:r>
-        <w:t xml:space="preserve">The default value of 35% corresponds to a nurse working approximately 60-hour weeks out of 168 total hours, matching the documented working pattern in the </w:t>
-      </w:r>
-      <w:proofErr w:type="spellStart"/>
-      <w:r>
-        <w:t>O'Quigley</w:t>
-      </w:r>
-      <w:proofErr w:type="spellEnd"/>
-      <w:r>
-        <w:t xml:space="preserve"> (2025) case analysis. The info box below the slider shows the equivalent hours per week and the ratio compared to the ward average.</w:t>
-      </w:r>
-      <w:r>
-        <w:br/>
-      </w:r>
-    </w:p>
-    <w:p>
-      <w:r>
-        <w:rPr>
-          <w:i/>
-          <w:iCs/>
-        </w:rPr>
-        <w:t xml:space="preserve">Suspect's shift probability </w:t>
-      </w:r>
-      <w:proofErr w:type="spellStart"/>
-      <w:r>
-        <w:rPr>
-          <w:i/>
-          <w:iCs/>
-        </w:rPr>
-        <w:t>p_suspect</w:t>
-      </w:r>
-      <w:proofErr w:type="spellEnd"/>
-      <w:r>
-        <w:rPr>
-          <w:i/>
-          <w:iCs/>
-        </w:rPr>
-        <w:t xml:space="preserve"> is set directly by this control (e.g., 35% = 0.35). This is not a multiplier on the ward mean but an absolute presence rate. Expected overlap E[X] = K × </w:t>
-      </w:r>
-      <w:proofErr w:type="spellStart"/>
-      <w:r>
-        <w:rPr>
-          <w:i/>
-          <w:iCs/>
-        </w:rPr>
-        <w:t>p_suspect</w:t>
-      </w:r>
-      <w:proofErr w:type="spellEnd"/>
-      <w:r>
-        <w:rPr>
-          <w:i/>
-          <w:iCs/>
-        </w:rPr>
-        <w:t xml:space="preserve"> where K is the incident count. The ratio displayed (e.g., '2.2× ward average') is calculated as </w:t>
-      </w:r>
-      <w:proofErr w:type="spellStart"/>
-      <w:r>
-        <w:rPr>
-          <w:i/>
-          <w:iCs/>
-        </w:rPr>
-        <w:t>p_suspect</w:t>
-      </w:r>
-      <w:proofErr w:type="spellEnd"/>
-      <w:r>
-        <w:rPr>
-          <w:i/>
-          <w:iCs/>
-        </w:rPr>
-        <w:t xml:space="preserve"> / </w:t>
-      </w:r>
-      <w:proofErr w:type="spellStart"/>
-      <w:r>
-        <w:rPr>
-          <w:i/>
-          <w:iCs/>
-        </w:rPr>
-        <w:t>μ_ward</w:t>
-      </w:r>
-      <w:proofErr w:type="spellEnd"/>
-      <w:r>
-        <w:rPr>
-          <w:i/>
-          <w:iCs/>
-        </w:rPr>
-        <w:t>, providing immediate context for how unusual the suspect's workload is relative to colleagues.</w:t>
-      </w:r>
-    </w:p>
-    <w:p>
-      <w:pPr>
-        <w:pStyle w:val="Heading3"/>
-      </w:pPr>
-      <w:r>
-        <w:t>Acuity Assignment Tilt</w:t>
-      </w:r>
-    </w:p>
-    <w:p>
-      <w:r>
-        <w:t>Experienced nurses are often assigned sicker patients. Sicker patients have more adverse events. This creates additional correlation between the nurse and incidents—through patient acuity, not wrongdoing.</w:t>
-      </w:r>
-    </w:p>
-    <w:p/>
-    <w:p>
-      <w:pPr>
-        <w:rPr>
-          <w:i/>
-          <w:iCs/>
-        </w:rPr>
-      </w:pPr>
-      <w:r>
-        <w:rPr>
-          <w:i/>
-          <w:iCs/>
-        </w:rPr>
-        <w:t xml:space="preserve">Only available in Binomial mode. Implements P(overlap | incident) = </w:t>
-      </w:r>
-      <w:proofErr w:type="spellStart"/>
-      <w:r>
-        <w:rPr>
-          <w:i/>
-          <w:iCs/>
-        </w:rPr>
-        <w:t>p_base</w:t>
-      </w:r>
-      <w:proofErr w:type="spellEnd"/>
-      <w:r>
-        <w:rPr>
-          <w:i/>
-          <w:iCs/>
-        </w:rPr>
-        <w:t xml:space="preserve"> × (1 + </w:t>
-      </w:r>
-      <w:proofErr w:type="spellStart"/>
-      <w:r>
-        <w:rPr>
-          <w:i/>
-          <w:iCs/>
-        </w:rPr>
-        <w:t>acuity_tilt</w:t>
-      </w:r>
-      <w:proofErr w:type="spellEnd"/>
-      <w:r>
-        <w:rPr>
-          <w:i/>
-          <w:iCs/>
-        </w:rPr>
-        <w:t>) for suspect. Models confounding through unobserved patient severity. In shift-based mode, this would require modelling non-uniform incident placement across shifts, which adds complexity.</w:t>
-      </w:r>
-    </w:p>
-    <w:p>
-      <w:pPr>
-        <w:pStyle w:val="Heading2"/>
-      </w:pPr>
-      <w:bookmarkStart w:id="9" w:name="_Toc219298634"/>
-      <w:r>
-        <w:lastRenderedPageBreak/>
-        <w:t>2.5 Selection Effect Parameters</w:t>
-      </w:r>
-      <w:bookmarkEnd w:id="9"/>
-    </w:p>
-    <w:p>
-      <w:r>
-        <w:t>(Visible only in Selection Effect mode)</w:t>
-      </w:r>
-    </w:p>
-    <w:p>
-      <w:pPr>
-        <w:pStyle w:val="Heading3"/>
-      </w:pPr>
-      <w:r>
-        <w:t>Total Concerning Events</w:t>
-      </w:r>
-    </w:p>
-    <w:p>
-      <w:r>
-        <w:t xml:space="preserve">The larger pool of events that </w:t>
-      </w:r>
-      <w:r>
-        <w:rPr>
-          <w:i/>
-          <w:iCs/>
-        </w:rPr>
-        <w:t>could</w:t>
-      </w:r>
-      <w:r>
-        <w:t xml:space="preserve"> have been flagged as suspicious. In reality, investigators review many events and select a subset for prosecution.</w:t>
-      </w:r>
-    </w:p>
-    <w:p>
-      <w:r>
-        <w:t>Models the denominator problem: if 100 adverse events occurred but only 25 were prosecuted, selection criteria matter enormously. Classic ascertainment bias scenario.</w:t>
-      </w:r>
-    </w:p>
-    <w:p>
-      <w:pPr>
-        <w:pStyle w:val="Heading3"/>
-      </w:pPr>
-      <w:r>
-        <w:t>Selection Bias</w:t>
-      </w:r>
-    </w:p>
-    <w:p>
-      <w:r>
-        <w:t>Relative weighting when selecting which events to classify as 'suspicious'. At 80%, suspect-present events are weighted 4:1 relative to suspect-absent events. The slider value w gives odds ratio w/(1−w</w:t>
-      </w:r>
-      <w:r>
-        <w:t>) (not a probability).</w:t>
-      </w:r>
-    </w:p>
-    <w:p>
-      <w:pPr>
-        <w:rPr>
-          <w:i/>
-          <w:iCs/>
-        </w:rPr>
-      </w:pPr>
-      <w:r>
-        <w:rPr>
-          <w:i/>
-          <w:iCs/>
-        </w:rPr>
-        <w:t xml:space="preserve">As </w:t>
-      </w:r>
-      <w:r>
-        <w:rPr>
-          <w:i/>
-          <w:iCs/>
-        </w:rPr>
-        <w:t xml:space="preserve">detailed under </w:t>
-      </w:r>
-      <w:r>
-        <w:rPr>
-          <w:i/>
-          <w:iCs/>
-        </w:rPr>
-        <w:t>2.1 (Selection Effect Mode), this section models ascertainment bias arising when events are flagged as suspicious partly because a suspect was present.</w:t>
-      </w:r>
-    </w:p>
-    <w:p>
-      <w:pPr>
-        <w:rPr>
-          <w:b/>
-          <w:bCs/>
-          <w:color w:val="000000"/>
-          <w:sz w:val="26"/>
-          <w:szCs w:val="26"/>
-        </w:rPr>
-      </w:pPr>
-    </w:p>
-    <w:p>
-      <w:pPr>
-        <w:pStyle w:val="Heading2"/>
-      </w:pPr>
-      <w:bookmarkStart w:id="10" w:name="_Toc219298635"/>
-      <w:r>
-        <w:t>2.6 Simulation Parameters</w:t>
-      </w:r>
-      <w:bookmarkEnd w:id="10"/>
-    </w:p>
-    <w:p>
-      <w:pPr>
-        <w:pStyle w:val="Heading3"/>
-      </w:pPr>
-      <w:r>
-        <w:t>Suspicious Incidents</w:t>
-      </w:r>
-    </w:p>
-    <w:p>
-      <w:r>
-        <w:t>The number of incidents being analysed. More incidents = more statistical power, but also more opportunities for random overlap.</w:t>
-      </w:r>
-    </w:p>
-    <w:p/>
-    <w:p>
-      <w:pPr>
-        <w:rPr>
-          <w:i/>
-          <w:iCs/>
-        </w:rPr>
-      </w:pPr>
-      <w:r>
-        <w:rPr>
-          <w:i/>
-          <w:iCs/>
-        </w:rPr>
-        <w:t>This is K in the hypergeometric model. Expected overlap E[X] = K × (</w:t>
-      </w:r>
-      <w:proofErr w:type="spellStart"/>
-      <w:r>
-        <w:rPr>
-          <w:i/>
-          <w:iCs/>
-        </w:rPr>
-        <w:t>nurse_shifts</w:t>
-      </w:r>
-      <w:proofErr w:type="spellEnd"/>
-      <w:r>
-        <w:rPr>
-          <w:i/>
-          <w:iCs/>
-        </w:rPr>
-        <w:t xml:space="preserve"> / </w:t>
-      </w:r>
-      <w:proofErr w:type="spellStart"/>
-      <w:r>
-        <w:rPr>
-          <w:i/>
-          <w:iCs/>
-        </w:rPr>
-        <w:t>total_shifts</w:t>
-      </w:r>
-      <w:proofErr w:type="spellEnd"/>
-      <w:r>
-        <w:rPr>
-          <w:i/>
-          <w:iCs/>
-        </w:rPr>
-        <w:t xml:space="preserve">). Variance scales </w:t>
-      </w:r>
-      <w:proofErr w:type="spellStart"/>
-      <w:r>
-        <w:rPr>
-          <w:i/>
-          <w:iCs/>
-        </w:rPr>
-        <w:t>sublinearly</w:t>
-      </w:r>
-      <w:proofErr w:type="spellEnd"/>
-      <w:r>
-        <w:rPr>
-          <w:i/>
-          <w:iCs/>
-        </w:rPr>
-        <w:t xml:space="preserve"> due to sampling without replacement.</w:t>
-      </w:r>
-    </w:p>
-    <w:p>
-      <w:pPr>
-        <w:pStyle w:val="Heading3"/>
-      </w:pPr>
-      <w:r>
-        <w:t>Monte Carlo Trials</w:t>
-      </w:r>
-    </w:p>
-    <w:p>
-      <w:r>
-        <w:t>How many simulated scenarios to run. More trials = more precise estimates, but slower. 2,000 is usually sufficient; increase to 10,000+ for publication-quality precision.</w:t>
-      </w:r>
-    </w:p>
-    <w:p/>
-    <w:p>
-      <w:pPr>
-        <w:rPr>
-          <w:i/>
-          <w:iCs/>
-        </w:rPr>
-      </w:pPr>
-      <w:r>
-        <w:rPr>
-          <w:i/>
-          <w:iCs/>
-        </w:rPr>
-        <w:t>Standard error of proportion estimate ≈ √(p(1−p)/N). At N=2000, SE ≈ 1.1% for p=0.5. Wilson score intervals provided for the key P(max other ≥ suspect) statistic.</w:t>
-      </w:r>
-    </w:p>
-    <w:p>
-      <w:pPr>
-        <w:pStyle w:val="Heading2"/>
-      </w:pPr>
-      <w:bookmarkStart w:id="11" w:name="_Toc219298636"/>
-      <w:r>
-        <w:t>2.7 Judicial Commentary Controls</w:t>
-      </w:r>
-      <w:bookmarkEnd w:id="11"/>
-    </w:p>
-    <w:p>
-      <w:r>
-        <w:t>The interface presents simulation results through two lenses: Prosecution and Defence. A dropdown selector ('Judicial commentary based on:') allows you to choose which statistic underpins the arguments presented.</w:t>
-      </w:r>
-    </w:p>
-    <w:p>
-      <w:pPr>
-        <w:pStyle w:val="Heading3"/>
-      </w:pPr>
-      <w:r>
-        <w:t>Statistic Selector</w:t>
+        <w:t xml:space="preserve">O'Quigley (2025) Case Analysis: </w:t>
+      </w:r>
+      <w:r>
+        <w:t>Parameters (α=3.2, β=17.25) derived from 'Use of roster charts in the investigation and prosecution of nurses suspected of inflicting deliberate harm on patients'.</w:t>
       </w:r>
     </w:p>
     <w:p>
@@ -3514,10 +1915,10 @@
           <w:b/>
           <w:bCs/>
         </w:rPr>
-        <w:t xml:space="preserve">Mean Overlap: </w:t>
-      </w:r>
-      <w:r>
-        <w:t>The average outcome across all Monte Carlo trials. This is the statistically honest summary—what typically happens.</w:t>
+        <w:t xml:space="preserve">Standard Core Team: </w:t>
+      </w:r>
+      <w:r>
+        <w:t>Mostly full-time staff with similar hours.</w:t>
       </w:r>
     </w:p>
     <w:p>
@@ -3533,10 +1934,10 @@
           <w:b/>
           <w:bCs/>
         </w:rPr>
-        <w:t xml:space="preserve">95th Percentile: </w:t>
-      </w:r>
-      <w:r>
-        <w:t>A rare outcome exceeded in only 5% of simulations. Represents an unlucky but not extraordinary result.</w:t>
+        <w:t xml:space="preserve">Agency-Heavy: </w:t>
+      </w:r>
+      <w:r>
+        <w:t>Mix of permanent and casual staff; highly varied hours.</w:t>
       </w:r>
     </w:p>
     <w:p>
@@ -3552,10 +1953,298 @@
           <w:b/>
           <w:bCs/>
         </w:rPr>
-        <w:t xml:space="preserve">99th Percentile: </w:t>
-      </w:r>
-      <w:r>
-        <w:t>A very rare outcome exceeded in only 1% of simulations. Starting to look unusual, but still within natural variation.</w:t>
+        <w:t xml:space="preserve">High-Acuity Ward: </w:t>
+      </w:r>
+      <w:r>
+        <w:t>Specialist unit with experienced staff working longer hours.</w:t>
+      </w:r>
+    </w:p>
+    <w:p>
+      <w:pPr>
+        <w:pStyle w:val="Heading3"/>
+      </w:pPr>
+      <w:r>
+        <w:t>Mean Workload</w:t>
+      </w:r>
+    </w:p>
+    <w:p>
+      <w:r>
+        <w:t>The average proportion of shifts worked across all nurses. Higher = busier ward or more full-time staff.</w:t>
+        <w:br/>
+      </w:r>
+    </w:p>
+    <w:p>
+      <w:r>
+        <w:rPr>
+          <w:i/>
+          <w:iCs/>
+        </w:rPr>
+        <w:t>This is E[X] = α/(α+β) for the underlying Beta distribution. Directly interpretable as the expected shift fraction. Converted to estimated hours/week via: hours = mean × 14 slots/week × 12 hours/slot.</w:t>
+      </w:r>
+    </w:p>
+    <w:p>
+      <w:pPr>
+        <w:pStyle w:val="Heading3"/>
+      </w:pPr>
+      <w:r>
+        <w:t>Consistency</w:t>
+      </w:r>
+    </w:p>
+    <w:p>
+      <w:r>
+        <w:t>How similar are nurses' workloads? Higher = everyone works similar hours. Lower = wide variation between full-time and casual staff.</w:t>
+        <w:br/>
+      </w:r>
+    </w:p>
+    <w:p>
+      <w:r>
+        <w:rPr>
+          <w:i/>
+          <w:iCs/>
+        </w:rPr>
+        <w:t>This is the concentration parameter κ = α + β. Higher κ means lower variance: Var[X] = μ(1−μ)/(κ+1). Reparameterisation: α = μκ, β = (1−μ)κ. This Mean/Consistency form is more intuitive than raw α/β while remaining mathematically equivalent.</w:t>
+      </w:r>
+    </w:p>
+    <w:p>
+      <w:pPr>
+        <w:pStyle w:val="Heading2"/>
+      </w:pPr>
+      <w:bookmarkStart w:id="8" w:name="_Toc219298633"/>
+      <w:r>
+        <w:t>2.4 Suspect Nurse Exposure</w:t>
+      </w:r>
+      <w:bookmarkEnd w:id="8"/>
+    </w:p>
+    <w:p>
+      <w:pPr>
+        <w:pStyle w:val="Heading3"/>
+      </w:pPr>
+      <w:r>
+        <w:t>Suspect Presence Rate</w:t>
+      </w:r>
+    </w:p>
+    <w:p>
+      <w:r>
+        <w:t>The percentage of all shifts worked by the suspect nurse. This directly sets the suspect's exposure level. A nurse working 35% of all shifts (≈59 hours/week based on 12-hour shifts) will naturally be present at approximately 35% of randomly-distributed incidents—this is arithmetic, not suspicion.</w:t>
+        <w:br/>
+      </w:r>
+    </w:p>
+    <w:p>
+      <w:r>
+        <w:t>The default value of 35% corresponds to a nurse working approximately 60-hour weeks out of 168 total hours, matching the documented working pattern in the O'Quigley (2025) case analysis. The info box below the slider shows the equivalent hours per week and the ratio compared to the ward average.</w:t>
+        <w:br/>
+      </w:r>
+    </w:p>
+    <w:p>
+      <w:r>
+        <w:rPr>
+          <w:i/>
+          <w:iCs/>
+        </w:rPr>
+        <w:t>Suspect's shift probability p_suspect is set directly by this control (e.g., 35% = 0.35). This is not a multiplier on the ward mean but an absolute presence rate. Expected overlap E[X] = K × p_suspect where K is the incident count. The ratio displayed (e.g., '2.2× ward average') is calculated as p_suspect / μ_ward, providing immediate context for how unusual the suspect's workload is relative to colleagues.</w:t>
+      </w:r>
+    </w:p>
+    <w:p>
+      <w:pPr>
+        <w:pStyle w:val="Heading3"/>
+      </w:pPr>
+      <w:r>
+        <w:t>Acuity Assignment Tilt</w:t>
+      </w:r>
+    </w:p>
+    <w:p>
+      <w:r>
+        <w:t>Experienced nurses are often assigned sicker patients. Sicker patients have more adverse events. This creates additional correlation between the nurse and incidents—through patient acuity, not wrongdoing.</w:t>
+      </w:r>
+    </w:p>
+    <w:p/>
+    <w:p>
+      <w:pPr>
+        <w:rPr>
+          <w:i/>
+          <w:iCs/>
+        </w:rPr>
+      </w:pPr>
+      <w:r>
+        <w:rPr>
+          <w:i/>
+          <w:iCs/>
+        </w:rPr>
+        <w:t>Only available in Binomial mode. Implements P(overlap | incident) = p_base × (1 + acuity_tilt) for suspect. Models confounding through unobserved patient severity. In shift-based mode, this would require modelling non-uniform incident placement across shifts, which adds complexity.</w:t>
+      </w:r>
+    </w:p>
+    <w:p>
+      <w:pPr>
+        <w:pStyle w:val="Heading2"/>
+      </w:pPr>
+      <w:bookmarkStart w:id="9" w:name="_Toc219298634"/>
+      <w:r>
+        <w:lastRenderedPageBreak/>
+        <w:t>2.5 Selection Effect Parameters</w:t>
+      </w:r>
+      <w:bookmarkEnd w:id="9"/>
+    </w:p>
+    <w:p>
+      <w:r>
+        <w:t>(Visible only in Selection Effect mode)</w:t>
+      </w:r>
+    </w:p>
+    <w:p>
+      <w:pPr>
+        <w:pStyle w:val="Heading3"/>
+      </w:pPr>
+      <w:r>
+        <w:t>Total Concerning Events</w:t>
+      </w:r>
+    </w:p>
+    <w:p>
+      <w:r>
+        <w:t xml:space="preserve">The larger pool of events that </w:t>
+      </w:r>
+      <w:r>
+        <w:rPr>
+          <w:i/>
+          <w:iCs/>
+        </w:rPr>
+        <w:t>could</w:t>
+      </w:r>
+      <w:r>
+        <w:t xml:space="preserve"> have been flagged as suspicious. In reality, investigators review many events and select a subset for prosecution.</w:t>
+      </w:r>
+    </w:p>
+    <w:p>
+      <w:r>
+        <w:t>Models the denominator problem: if 100 adverse events occurred but only 25 were prosecuted, selection criteria matter enormously. Classic ascertainment bias scenario.</w:t>
+      </w:r>
+    </w:p>
+    <w:p>
+      <w:pPr>
+        <w:pStyle w:val="Heading3"/>
+      </w:pPr>
+      <w:r>
+        <w:t>Selection Bias</w:t>
+      </w:r>
+    </w:p>
+    <w:p>
+      <w:r>
+        <w:t>Relative weighting when selecting which events to classify as 'suspicious'. At 80%, suspect-present events are weighted 4:1 relative to suspect-absent events. The slider value w gives odds ratio w/(1−w) (not a probability).</w:t>
+      </w:r>
+    </w:p>
+    <w:p>
+      <w:pPr>
+        <w:rPr>
+          <w:i/>
+          <w:iCs/>
+        </w:rPr>
+      </w:pPr>
+      <w:r>
+        <w:rPr>
+          <w:i/>
+          <w:iCs/>
+        </w:rPr>
+        <w:t>As detailed under 2.1 (Selection Effect Mode), this section models ascertainment bias arising when events are flagged as suspicious partly because a suspect was present.</w:t>
+      </w:r>
+    </w:p>
+    <w:p>
+      <w:pPr>
+        <w:rPr>
+          <w:b/>
+          <w:bCs/>
+          <w:color w:val="000000"/>
+          <w:sz w:val="26"/>
+          <w:szCs w:val="26"/>
+        </w:rPr>
+      </w:pPr>
+    </w:p>
+    <w:p>
+      <w:pPr>
+        <w:pStyle w:val="Heading2"/>
+      </w:pPr>
+      <w:bookmarkStart w:id="10" w:name="_Toc219298635"/>
+      <w:r>
+        <w:t>2.6 Simulation Parameters</w:t>
+      </w:r>
+      <w:bookmarkEnd w:id="10"/>
+    </w:p>
+    <w:p>
+      <w:pPr>
+        <w:pStyle w:val="Heading3"/>
+      </w:pPr>
+      <w:r>
+        <w:t>Suspicious Incidents</w:t>
+      </w:r>
+    </w:p>
+    <w:p>
+      <w:r>
+        <w:t>The number of incidents being analysed. More incidents = more statistical power, but also more opportunities for random overlap.</w:t>
+      </w:r>
+    </w:p>
+    <w:p/>
+    <w:p>
+      <w:pPr>
+        <w:rPr>
+          <w:i/>
+          <w:iCs/>
+        </w:rPr>
+      </w:pPr>
+      <w:r>
+        <w:rPr>
+          <w:i/>
+          <w:iCs/>
+        </w:rPr>
+        <w:t>This is K in the hypergeometric model. Expected overlap E[X] = K × (nurse_shifts / total_shifts). Variance scales sublinearly due to sampling without replacement.</w:t>
+      </w:r>
+    </w:p>
+    <w:p>
+      <w:pPr>
+        <w:pStyle w:val="Heading3"/>
+      </w:pPr>
+      <w:r>
+        <w:t>Monte Carlo Trials</w:t>
+      </w:r>
+    </w:p>
+    <w:p>
+      <w:r>
+        <w:t>How many simulated scenarios to run. More trials = more precise estimates, but slower. 2,000 is usually sufficient; increase to 10,000+ for publication-quality precision.</w:t>
+      </w:r>
+    </w:p>
+    <w:p/>
+    <w:p>
+      <w:pPr>
+        <w:rPr>
+          <w:i/>
+          <w:iCs/>
+        </w:rPr>
+      </w:pPr>
+      <w:r>
+        <w:rPr>
+          <w:i/>
+          <w:iCs/>
+        </w:rPr>
+        <w:t>Standard error of proportion estimate ≈ √(p(1−p)/N). At N=2000, SE ≈ 1.1% for p=0.5. Wilson score intervals provided for the key P(max other ≥ suspect) statistic.</w:t>
+      </w:r>
+    </w:p>
+    <w:p>
+      <w:pPr>
+        <w:pStyle w:val="Heading2"/>
+      </w:pPr>
+      <w:bookmarkStart w:id="11" w:name="_Toc219298636"/>
+      <w:r>
+        <w:t>2.7 Judicial Commentary Controls</w:t>
+      </w:r>
+      <w:bookmarkEnd w:id="11"/>
+    </w:p>
+    <w:p>
+      <w:r>
+        <w:t>The interface presents simulation results through two lenses: Prosecution and Defence. A dropdown selector ('Judicial commentary based on:') allows you to choose which statistic underpins the arguments presented.</w:t>
+      </w:r>
+    </w:p>
+    <w:p>
+      <w:pPr>
+        <w:pStyle w:val="Heading3"/>
+      </w:pPr>
+      <w:r>
+        <w:t>Statistic Selector</w:t>
       </w:r>
     </w:p>
     <w:p>
@@ -3571,248 +2260,10 @@
           <w:b/>
           <w:bCs/>
         </w:rPr>
-        <w:t xml:space="preserve">Maximum Peak: </w:t>
-      </w:r>
-      <w:r>
-        <w:t>The single most extreme outcome observed across all trials. The realised case in front of a court is a single draw from a distribution; emphasising the maximum illustrates how persuasive extreme realised outcomes can look.</w:t>
-      </w:r>
-    </w:p>
-    <w:p>
-      <w:pPr>
-        <w:rPr>
-          <w:i/>
-          <w:iCs/>
-        </w:rPr>
-      </w:pPr>
-    </w:p>
-    <w:p>
-      <w:r>
-        <w:rPr>
-          <w:i/>
-          <w:iCs/>
-        </w:rPr>
-        <w:lastRenderedPageBreak/>
-        <w:t>The selector enables sensitivity analysis: prosecutors don't present average cases—they present the extreme case in front of them. By toggling between Mean and Maximum Peak, users can see how the same underlying reality produces vastly different rhetorical framings. The defence arguments update accordingly, demonstrating appropriate rebuttals for each statistic cited.</w:t>
-      </w:r>
-    </w:p>
-    <w:p>
-      <w:pPr>
-        <w:pStyle w:val="Heading3"/>
-      </w:pPr>
-      <w:r>
-        <w:t>Prosecution View</w:t>
-      </w:r>
-    </w:p>
-    <w:p>
-      <w:r>
-        <w:t>Emphasises raw overlap counts and presence rates. 'The defendant was present at 92% of incidents!' This framing ignores workload as a confounding variable.</w:t>
-      </w:r>
-    </w:p>
-    <w:p>
-      <w:pPr>
-        <w:pStyle w:val="Heading3"/>
-      </w:pPr>
-      <w:r>
-        <w:t>Defence View</w:t>
-      </w:r>
-    </w:p>
-    <w:p>
-      <w:r>
-        <w:t xml:space="preserve">Contextualises overlap against </w:t>
-      </w:r>
-      <w:r>
-        <w:rPr>
-          <w:i/>
-          <w:iCs/>
-        </w:rPr>
-        <w:t>expected</w:t>
-      </w:r>
-      <w:r>
-        <w:t xml:space="preserve"> overlap given workload. Shows the ratio of observed/expected, the probability that innocent nurses match or exceed the overlap, and explains why the cited statistic (whether mean or maximum) does not constitute evidence of guilt.</w:t>
-      </w:r>
-      <w:r>
-        <w:br/>
-      </w:r>
-    </w:p>
-    <w:p>
-      <w:r>
-        <w:rPr>
-          <w:i/>
-          <w:iCs/>
-        </w:rPr>
-        <w:t>This juxtaposition illustrates the prosecutor's fallacy: treating P(evidence | innocence) as if it were P(innocence | evidence). The defence view correctly conditions on the relevant covariates (workload, acuity) before drawing inferences. When the prosecution cites a maximum peak, the defence notes that someone will always be the maximum—this is not evidence of an anomaly.</w:t>
-      </w:r>
-    </w:p>
-    <w:p>
-      <w:pPr>
-        <w:rPr>
-          <w:b/>
-          <w:bCs/>
-          <w:color w:val="000000"/>
-          <w:sz w:val="26"/>
-          <w:szCs w:val="26"/>
-        </w:rPr>
-      </w:pPr>
-    </w:p>
-    <w:p>
-      <w:pPr>
-        <w:pStyle w:val="Heading2"/>
-      </w:pPr>
-      <w:bookmarkStart w:id="12" w:name="_Toc219298637"/>
-      <w:r>
-        <w:t>2.8 Results Displays</w:t>
-      </w:r>
-      <w:bookmarkEnd w:id="12"/>
-    </w:p>
-    <w:p>
-      <w:pPr>
-        <w:pStyle w:val="Heading3"/>
-      </w:pPr>
-      <w:r>
-        <w:t>Main Chart</w:t>
-      </w:r>
-    </w:p>
-    <w:p>
-      <w:r>
-        <w:t>Shows overlap distributions for all 38 nurses, sorted by workload. The bars show averages; the grey ranges show typical variation (5th–95th percentile); amber triangles mark rare outcomes (99</w:t>
-      </w:r>
-    </w:p>
-    <w:p>
-      <w:r>
-        <w:t>+</w:t>
-      </w:r>
-      <w:proofErr w:type="spellStart"/>
-      <w:r>
-        <w:t>th</w:t>
-      </w:r>
-      <w:proofErr w:type="spellEnd"/>
-      <w:r>
-        <w:t xml:space="preserve"> percentile); red diamonds mark the most extreme outcome seen across all trials.</w:t>
-      </w:r>
-      <w:r>
-        <w:br/>
-      </w:r>
-    </w:p>
-    <w:p>
-      <w:r>
-        <w:t>In No Pre-designation mode, the x-axis displays 'Workload Rank (lowest → highest)' rather than nurse numbers, reinforcing that these are anonymous positions in the workload distribution—not identifiable individuals. This prevents the misleading inference that 'Nurse 17 is usually suspicious'.</w:t>
-      </w:r>
-      <w:r>
-        <w:br/>
-      </w:r>
-    </w:p>
-    <w:p>
-      <w:r>
-        <w:t>The legend is ordered from least to most extreme: Mean Overlap → 5th–95th Range → 99th Percentile → Max Peak (most extreme observed). This visual progression reinforces the conceptual journey from 'typical' to 'extreme'.</w:t>
-      </w:r>
-    </w:p>
-    <w:p>
-      <w:r>
-        <w:t>Displays: E[</w:t>
-      </w:r>
-      <w:proofErr w:type="spellStart"/>
-      <w:r>
-        <w:t>overlap_n</w:t>
-      </w:r>
-      <w:proofErr w:type="spellEnd"/>
-      <w:r>
-        <w:t>], P5[</w:t>
-      </w:r>
-      <w:proofErr w:type="spellStart"/>
-      <w:r>
-        <w:t>overlap_n</w:t>
-      </w:r>
-      <w:proofErr w:type="spellEnd"/>
-      <w:r>
-        <w:t>], P95[</w:t>
-      </w:r>
-      <w:proofErr w:type="spellStart"/>
-      <w:r>
-        <w:t>overlap_n</w:t>
-      </w:r>
-      <w:proofErr w:type="spellEnd"/>
-      <w:r>
-        <w:t>], P99[</w:t>
-      </w:r>
-      <w:proofErr w:type="spellStart"/>
-      <w:r>
-        <w:t>overlap_n</w:t>
-      </w:r>
-      <w:proofErr w:type="spellEnd"/>
-      <w:r>
-        <w:t>], max[</w:t>
-      </w:r>
-      <w:proofErr w:type="spellStart"/>
-      <w:r>
-        <w:t>overlap_n</w:t>
-      </w:r>
-      <w:proofErr w:type="spellEnd"/>
-      <w:r>
-        <w:t>] for n ∈ {1,...,38}. The gap between P99 and max illustrates extreme value behaviour—prosecutors often fixate on the max without recognising it as an order statistic extremum.</w:t>
-      </w:r>
-    </w:p>
-    <w:p>
-      <w:pPr>
-        <w:rPr>
-          <w:b/>
-          <w:bCs/>
-          <w:color w:val="000000"/>
-          <w:sz w:val="24"/>
-          <w:szCs w:val="24"/>
-        </w:rPr>
-      </w:pPr>
-      <w:r>
-        <w:br w:type="page"/>
-      </w:r>
-    </w:p>
-    <w:p>
-      <w:pPr>
-        <w:pStyle w:val="Heading3"/>
-      </w:pPr>
-      <w:r>
-        <w:lastRenderedPageBreak/>
-        <w:t>Expected vs Observed Panel</w:t>
-      </w:r>
-    </w:p>
-    <w:p>
-      <w:r>
-        <w:t>The critical comparison. 'Expected' shows how many overlaps you'd predict from workload alone; 'Observed' shows the simulation mean; 'Ratio' shows whether observed exceeds expected. A ratio near 1.0 means the overlap is fully explained by hours worked.</w:t>
-      </w:r>
-    </w:p>
-    <w:p/>
-    <w:p>
-      <w:r>
-        <w:t>Note: This panel is hidden in No Pre-designation mode because comparing an average nurse's expected overlap against the maximum overlap is conceptually misleading—they are not comparable quantities.</w:t>
-      </w:r>
-    </w:p>
-    <w:p/>
-    <w:p>
-      <w:r>
-        <w:t>Expected = K × (</w:t>
-      </w:r>
-      <w:proofErr w:type="spellStart"/>
-      <w:r>
-        <w:t>n_suspect</w:t>
-      </w:r>
-      <w:proofErr w:type="spellEnd"/>
-      <w:r>
-        <w:t xml:space="preserve"> / </w:t>
-      </w:r>
-      <w:proofErr w:type="spellStart"/>
-      <w:r>
-        <w:t>N_total</w:t>
-      </w:r>
-      <w:proofErr w:type="spellEnd"/>
-      <w:r>
-        <w:t>) from hypergeometric expectation. Ratio = Observed/Expected. Under H₀, ratio → 1.0. Significant deviation suggests either (a) model misspecification, (b) acuity confounding, or (c) genuine anomaly requiring further investigation.</w:t>
-      </w:r>
-    </w:p>
-    <w:p>
-      <w:pPr>
-        <w:pStyle w:val="Heading3"/>
-      </w:pPr>
-      <w:r>
-        <w:t>Statistics Panel</w:t>
+        <w:t xml:space="preserve">Mean Overlap: </w:t>
+      </w:r>
+      <w:r>
+        <w:t>The average outcome across all Monte Carlo trials. This is the statistically honest summary—what typically happens.</w:t>
       </w:r>
     </w:p>
     <w:p>
@@ -3828,10 +2279,10 @@
           <w:b/>
           <w:bCs/>
         </w:rPr>
-        <w:t xml:space="preserve">Ward Mean Fill: </w:t>
-      </w:r>
-      <w:r>
-        <w:t>Average workload across all nurses (excluding suspect).</w:t>
+        <w:t xml:space="preserve">95th Percentile: </w:t>
+      </w:r>
+      <w:r>
+        <w:t>A rare outcome exceeded in only 5% of simulations. Represents an unlucky but not extraordinary result.</w:t>
       </w:r>
     </w:p>
     <w:p>
@@ -3847,10 +2298,10 @@
           <w:b/>
           <w:bCs/>
         </w:rPr>
-        <w:t xml:space="preserve">Highest Other Nurse: </w:t>
-      </w:r>
-      <w:r>
-        <w:t>The highest-working innocent nurse's shift fraction.</w:t>
+        <w:t xml:space="preserve">99th Percentile: </w:t>
+      </w:r>
+      <w:r>
+        <w:t>A very rare outcome exceeded in only 1% of simulations. Starting to look unusual, but still within natural variation.</w:t>
       </w:r>
     </w:p>
     <w:p>
@@ -3866,10 +2317,178 @@
           <w:b/>
           <w:bCs/>
         </w:rPr>
-        <w:t xml:space="preserve">Suspect Workload: </w:t>
-      </w:r>
-      <w:r>
-        <w:t>The suspect's shift fraction, set directly via the Suspect Presence Rate control.</w:t>
+        <w:t xml:space="preserve">Maximum Peak: </w:t>
+      </w:r>
+      <w:r>
+        <w:t>The single most extreme outcome observed across all trials. The realised case in front of a court is a single draw from a distribution; emphasising the maximum illustrates how persuasive extreme realised outcomes can look.</w:t>
+      </w:r>
+    </w:p>
+    <w:p>
+      <w:pPr>
+        <w:rPr>
+          <w:i/>
+          <w:iCs/>
+        </w:rPr>
+      </w:pPr>
+    </w:p>
+    <w:p>
+      <w:r>
+        <w:rPr>
+          <w:i/>
+          <w:iCs/>
+        </w:rPr>
+        <w:lastRenderedPageBreak/>
+        <w:t>The selector enables sensitivity analysis: prosecutors don't present average cases—they present the extreme case in front of them. By toggling between Mean and Maximum Peak, users can see how the same underlying reality produces vastly different rhetorical framings. The defence arguments update accordingly, demonstrating appropriate rebuttals for each statistic cited.</w:t>
+      </w:r>
+    </w:p>
+    <w:p>
+      <w:pPr>
+        <w:pStyle w:val="Heading3"/>
+      </w:pPr>
+      <w:r>
+        <w:t>Prosecution View</w:t>
+      </w:r>
+    </w:p>
+    <w:p>
+      <w:r>
+        <w:t>Emphasises raw overlap counts and presence rates. 'The defendant was present at 92% of incidents!' This framing ignores workload as a confounding variable.</w:t>
+      </w:r>
+    </w:p>
+    <w:p>
+      <w:pPr>
+        <w:pStyle w:val="Heading3"/>
+      </w:pPr>
+      <w:r>
+        <w:t>Defence View</w:t>
+      </w:r>
+    </w:p>
+    <w:p>
+      <w:r>
+        <w:t xml:space="preserve">Contextualises overlap against </w:t>
+      </w:r>
+      <w:r>
+        <w:rPr>
+          <w:i/>
+          <w:iCs/>
+        </w:rPr>
+        <w:t>expected</w:t>
+      </w:r>
+      <w:r>
+        <w:t xml:space="preserve"> overlap given workload. Shows the ratio of observed/expected, the probability that innocent nurses match or exceed the overlap, and explains why the cited statistic (whether mean or maximum) does not constitute evidence of guilt.</w:t>
+        <w:br/>
+      </w:r>
+    </w:p>
+    <w:p>
+      <w:r>
+        <w:rPr>
+          <w:i/>
+          <w:iCs/>
+        </w:rPr>
+        <w:t>This juxtaposition illustrates the prosecutor's fallacy: treating P(evidence | innocence) as if it were P(innocence | evidence). The defence view correctly conditions on the relevant covariates (workload, acuity) before drawing inferences. When the prosecution cites a maximum peak, the defence notes that someone will always be the maximum—this is not evidence of an anomaly.</w:t>
+      </w:r>
+    </w:p>
+    <w:p>
+      <w:pPr>
+        <w:rPr>
+          <w:b/>
+          <w:bCs/>
+          <w:color w:val="000000"/>
+          <w:sz w:val="26"/>
+          <w:szCs w:val="26"/>
+        </w:rPr>
+      </w:pPr>
+    </w:p>
+    <w:p>
+      <w:pPr>
+        <w:pStyle w:val="Heading2"/>
+      </w:pPr>
+      <w:bookmarkStart w:id="12" w:name="_Toc219298637"/>
+      <w:r>
+        <w:t>2.8 Results Displays</w:t>
+      </w:r>
+      <w:bookmarkEnd w:id="12"/>
+    </w:p>
+    <w:p>
+      <w:pPr>
+        <w:pStyle w:val="Heading3"/>
+      </w:pPr>
+      <w:r>
+        <w:t>Main Chart</w:t>
+      </w:r>
+    </w:p>
+    <w:p>
+      <w:r>
+        <w:t>Shows overlap distributions for all 38 nurses, sorted by workload. The bars show averages; the grey ranges show typical variation (5th–95th percentile); amber triangles mark rare outcomes (99</w:t>
+      </w:r>
+    </w:p>
+    <w:p>
+      <w:r>
+        <w:t>+th percentile); red diamonds mark the most extreme outcome seen across all trials.</w:t>
+        <w:br/>
+      </w:r>
+    </w:p>
+    <w:p>
+      <w:r>
+        <w:t>In No Pre-designation mode, the x-axis displays 'Workload Rank (lowest → highest)' rather than nurse numbers, reinforcing that these are anonymous positions in the workload distribution—not identifiable individuals. This prevents the misleading inference that 'Nurse 17 is usually suspicious'.</w:t>
+        <w:br/>
+      </w:r>
+    </w:p>
+    <w:p>
+      <w:r>
+        <w:t>The legend is ordered from least to most extreme: Mean Overlap → 5th–95th Range → 99th Percentile → Max Peak (most extreme observed). This visual progression reinforces the conceptual journey from 'typical' to 'extreme'.</w:t>
+      </w:r>
+    </w:p>
+    <w:p>
+      <w:r>
+        <w:t>Displays: E[overlap_n], P5[overlap_n], P95[overlap_n], P99[overlap_n], max[overlap_n] for n ∈ {1,...,38}. The gap between P99 and max illustrates extreme value behaviour—prosecutors often fixate on the max without recognising it as an order statistic extremum.</w:t>
+      </w:r>
+    </w:p>
+    <w:p>
+      <w:pPr>
+        <w:rPr>
+          <w:b/>
+          <w:bCs/>
+          <w:color w:val="000000"/>
+          <w:sz w:val="24"/>
+          <w:szCs w:val="24"/>
+        </w:rPr>
+      </w:pPr>
+      <w:r>
+        <w:br w:type="page"/>
+      </w:r>
+    </w:p>
+    <w:p>
+      <w:pPr>
+        <w:pStyle w:val="Heading3"/>
+      </w:pPr>
+      <w:r>
+        <w:lastRenderedPageBreak/>
+        <w:t>Expected vs Observed Panel</w:t>
+      </w:r>
+    </w:p>
+    <w:p>
+      <w:r>
+        <w:t>The critical comparison. 'Expected' shows how many overlaps you'd predict from workload alone; 'Observed' shows the simulation mean; 'Ratio' shows whether observed exceeds expected. A ratio near 1.0 means the overlap is fully explained by hours worked.</w:t>
+      </w:r>
+    </w:p>
+    <w:p/>
+    <w:p>
+      <w:r>
+        <w:t>Note: This panel is hidden in No Pre-designation mode because comparing an average nurse's expected overlap against the maximum overlap is conceptually misleading—they are not comparable quantities.</w:t>
+      </w:r>
+    </w:p>
+    <w:p/>
+    <w:p>
+      <w:r>
+        <w:t>Expected = K × (n_suspect / N_total) from hypergeometric expectation. Ratio = Observed/Expected. Under H₀, ratio → 1.0. Significant deviation suggests either (a) model misspecification, (b) acuity confounding, or (c) genuine anomaly requiring further investigation.</w:t>
+      </w:r>
+    </w:p>
+    <w:p>
+      <w:pPr>
+        <w:pStyle w:val="Heading3"/>
+      </w:pPr>
+      <w:r>
+        <w:t>Statistics Panel</w:t>
       </w:r>
     </w:p>
     <w:p>
@@ -3885,93 +2504,10 @@
           <w:b/>
           <w:bCs/>
         </w:rPr>
-        <w:t xml:space="preserve">P(Innocent Match): </w:t>
-      </w:r>
-      <w:r>
-        <w:t>(Shown in Standard and Selection Effect modes only.) The key statistic—how often an innocent nurse matched or exceeded the suspect's overlap. Includes a 95% confidence interval. In No Pre-designation mode, this displays 'N/A' because there is no designated suspect to compare against.</w:t>
-      </w:r>
-      <w:r>
-        <w:br/>
-      </w:r>
-    </w:p>
-    <w:p>
-      <w:pPr>
-        <w:rPr>
-          <w:b/>
-          <w:bCs/>
-          <w:color w:val="000000"/>
-          <w:sz w:val="24"/>
-          <w:szCs w:val="24"/>
-        </w:rPr>
-      </w:pPr>
-      <w:r>
-        <w:rPr>
-          <w:i/>
-          <w:iCs/>
-        </w:rPr>
-        <w:t>P(Innocent Match) is an empirical tail probability from Monte Carlo sampling. A Wilson score interval provides frequentist coverage for this binomial proportion. High values (e.g., &gt;5%) indicate the suspect's overlap is not uniquely extreme given workload heterogeneity.</w:t>
-      </w:r>
-    </w:p>
-    <w:p>
-      <w:pPr>
-        <w:pStyle w:val="Heading3"/>
-      </w:pPr>
-      <w:r>
-        <w:t>Multiple Comparisons Panel</w:t>
-      </w:r>
-    </w:p>
-    <w:p>
-      <w:r>
-        <w:rPr>
-          <w:b/>
-          <w:bCs/>
-        </w:rPr>
-        <w:t>In suspect-designated modes, this displays the percentage of simulations where at least one other nurse matched or exceeded the suspect. This addresses the key fallacy: 'someone has to be the maximum, and being the maximum isn't evidence of guilt.'</w:t>
-      </w:r>
-      <w:r>
-        <w:rPr>
-          <w:b/>
-          <w:bCs/>
-        </w:rPr>
-        <w:br/>
-      </w:r>
-    </w:p>
-    <w:p>
-      <w:r>
-        <w:t>In No Pre-designation mode, the simulator instead reports order statistics of the maximum overlap (median / P95 / P99 / max) across trials. This directly visualises the multiple testing burden: with 38 nurses, one will be the maximum even under innocence; the question is whether that maximum is surprising.</w:t>
-      </w:r>
-    </w:p>
-    <w:p>
-      <w:pPr>
-        <w:pStyle w:val="Heading1"/>
-      </w:pPr>
-      <w:bookmarkStart w:id="13" w:name="_Toc219298638"/>
-      <w:r>
-        <w:t>3. Incident Pattern Simulator: Interpretation Guidance</w:t>
-      </w:r>
-      <w:bookmarkEnd w:id="13"/>
-    </w:p>
-    <w:p>
-      <w:pPr>
-        <w:pStyle w:val="Heading2"/>
-      </w:pPr>
-      <w:bookmarkStart w:id="14" w:name="_Toc219298639"/>
-      <w:r>
-        <w:t>3.1 When Overlap Is NOT Suspicious</w:t>
-      </w:r>
-      <w:bookmarkEnd w:id="14"/>
-      <w:r>
-        <w:br/>
-      </w:r>
-      <w:r>
-        <w:br/>
-      </w:r>
-      <w:r>
-        <w:rPr>
-          <w:b w:val="0"/>
-          <w:bCs w:val="0"/>
-        </w:rPr>
-        <w:t>Indicators include:</w:t>
+        <w:t xml:space="preserve">Ward Mean Fill: </w:t>
+      </w:r>
+      <w:r>
+        <w:t>Average workload across all nurses (excluding suspect).</w:t>
       </w:r>
     </w:p>
     <w:p>
@@ -3983,7 +2519,14 @@
         </w:numPr>
       </w:pPr>
       <w:r>
-        <w:t>Observed/Expected ratio is close to 1.0 (within 1.0–1.3)</w:t>
+        <w:rPr>
+          <w:b/>
+          <w:bCs/>
+        </w:rPr>
+        <w:t xml:space="preserve">Highest Other Nurse: </w:t>
+      </w:r>
+      <w:r>
+        <w:t>The highest-working innocent nurse's shift fraction.</w:t>
       </w:r>
     </w:p>
     <w:p>
@@ -3995,7 +2538,14 @@
         </w:numPr>
       </w:pPr>
       <w:r>
-        <w:t>P(Innocent Match) exceeds 5%—ideally much higher</w:t>
+        <w:rPr>
+          <w:b/>
+          <w:bCs/>
+        </w:rPr>
+        <w:t xml:space="preserve">Suspect Workload: </w:t>
+      </w:r>
+      <w:r>
+        <w:t>The suspect's shift fraction, set directly via the Suspect Presence Rate control.</w:t>
       </w:r>
     </w:p>
     <w:p>
@@ -4007,7 +2557,87 @@
         </w:numPr>
       </w:pPr>
       <w:r>
-        <w:t>Suspect's workload is substantially above average</w:t>
+        <w:rPr>
+          <w:b/>
+          <w:bCs/>
+        </w:rPr>
+        <w:t xml:space="preserve">P(Innocent Match): </w:t>
+      </w:r>
+      <w:r>
+        <w:t>(Shown in Standard and Selection Effect modes only.) The key statistic—how often an innocent nurse matched or exceeded the suspect's overlap. Includes a 95% confidence interval. In No Pre-designation mode, this displays 'N/A' because there is no designated suspect to compare against.</w:t>
+        <w:br/>
+      </w:r>
+    </w:p>
+    <w:p>
+      <w:pPr>
+        <w:rPr>
+          <w:b/>
+          <w:bCs/>
+          <w:color w:val="000000"/>
+          <w:sz w:val="24"/>
+          <w:szCs w:val="24"/>
+        </w:rPr>
+      </w:pPr>
+      <w:r>
+        <w:rPr>
+          <w:i/>
+          <w:iCs/>
+        </w:rPr>
+        <w:t>P(Innocent Match) is an empirical tail probability from Monte Carlo sampling. A Wilson score interval provides frequentist coverage for this binomial proportion. High values (e.g., &gt;5%) indicate the suspect's overlap is not uniquely extreme given workload heterogeneity.</w:t>
+      </w:r>
+    </w:p>
+    <w:p>
+      <w:pPr>
+        <w:pStyle w:val="Heading3"/>
+      </w:pPr>
+      <w:r>
+        <w:t>Multiple Comparisons Panel</w:t>
+      </w:r>
+    </w:p>
+    <w:p>
+      <w:r>
+        <w:rPr>
+          <w:b/>
+          <w:bCs/>
+        </w:rPr>
+        <w:t>In suspect-designated modes, this displays the percentage of simulations where at least one other nurse matched or exceeded the suspect. This addresses the key fallacy: 'someone has to be the maximum, and being the maximum isn't evidence of guilt.'</w:t>
+        <w:br/>
+      </w:r>
+    </w:p>
+    <w:p>
+      <w:r>
+        <w:t>In No Pre-designation mode, the simulator instead reports order statistics of the maximum overlap (median / P95 / P99 / max) across trials. This directly visualises the multiple testing burden: with 38 nurses, one will be the maximum even under innocence; the question is whether that maximum is surprising.</w:t>
+      </w:r>
+    </w:p>
+    <w:p>
+      <w:pPr>
+        <w:pStyle w:val="Heading1"/>
+      </w:pPr>
+      <w:bookmarkStart w:id="13" w:name="_Toc219298638"/>
+      <w:r>
+        <w:t>3. Incident Pattern Simulator: Interpretation Guidance</w:t>
+      </w:r>
+      <w:bookmarkEnd w:id="13"/>
+    </w:p>
+    <w:p>
+      <w:pPr>
+        <w:pStyle w:val="Heading2"/>
+      </w:pPr>
+      <w:bookmarkStart w:id="14" w:name="_Toc219298639"/>
+      <w:r>
+        <w:t>3.1 When Overlap Is NOT Suspicious</w:t>
+      </w:r>
+      <w:bookmarkEnd w:id="14"/>
+      <w:r>
+        <w:br/>
+        <w:br/>
+      </w:r>
+      <w:r>
+        <w:rPr>
+          <w:b w:val="0"/>
+          <w:bCs w:val="0"/>
+        </w:rPr>
+        <w:t>Indicators include:</w:t>
       </w:r>
     </w:p>
     <w:p>
@@ -4019,7 +2649,7 @@
         </w:numPr>
       </w:pPr>
       <w:r>
-        <w:t>Suspect was assigned higher-acuity patients</w:t>
+        <w:t>Observed/Expected ratio is close to 1.0 (within 1.0–1.3)</w:t>
       </w:r>
     </w:p>
     <w:p>
@@ -4031,72 +2661,8 @@
         </w:numPr>
       </w:pPr>
       <w:r>
-        <w:t>Selection Effect mode shows inflation from investigator bias</w:t>
-      </w:r>
-    </w:p>
-    <w:p>
-      <w:pPr>
-        <w:pStyle w:val="Heading2"/>
-      </w:pPr>
-      <w:bookmarkStart w:id="15" w:name="_Toc219298640"/>
-      <w:r>
-        <w:lastRenderedPageBreak/>
-        <w:t>3.2 The Prosecutor's Gap</w:t>
-      </w:r>
-      <w:bookmarkEnd w:id="15"/>
-    </w:p>
-    <w:p>
-      <w:r>
-        <w:t xml:space="preserve">Note the distance on the chart between the 99th percentile (amber triangle) and the maximum peak (red diamond). Prosecutors may seize upon this maximum—an outlier that occurs </w:t>
-      </w:r>
-      <w:r>
-        <w:rPr>
-          <w:i/>
-          <w:iCs/>
-        </w:rPr>
-        <w:t>naturally</w:t>
-      </w:r>
-      <w:r>
-        <w:t xml:space="preserve"> in large datasets—and present it as impossible coincidence. But someone will </w:t>
-      </w:r>
-      <w:r>
-        <w:rPr>
-          <w:i/>
-          <w:iCs/>
-        </w:rPr>
-        <w:t>always</w:t>
-      </w:r>
-      <w:r>
-        <w:t xml:space="preserve"> be the maximum. The question is whether that maximum is unusual </w:t>
-      </w:r>
-      <w:r>
-        <w:rPr>
-          <w:i/>
-          <w:iCs/>
-        </w:rPr>
-        <w:t>given their exposure</w:t>
-      </w:r>
-      <w:r>
-        <w:t>.</w:t>
-      </w:r>
-      <w:r>
-        <w:br/>
-      </w:r>
-    </w:p>
-    <w:p>
-      <w:r>
-        <w:t>The statistic selector allows you to demonstrate this gap directly: toggle from 'Mean Overlap' to 'Maximum Peak' and observe how the prosecution's argument transforms from underwhelming to apparently damning—while the underlying reality (no wrongdoing in the model) remains unchanged.</w:t>
-      </w:r>
-    </w:p>
-    <w:p>
-      <w:pPr>
-        <w:pStyle w:val="Heading2"/>
-      </w:pPr>
-      <w:bookmarkStart w:id="16" w:name="_Toc219298641"/>
-      <w:r>
-        <w:t>3.3 Key Questions for Any Case</w:t>
-      </w:r>
-      <w:bookmarkEnd w:id="16"/>
+        <w:t>P(Innocent Match) exceeds 5%—ideally much higher</w:t>
+      </w:r>
     </w:p>
     <w:p>
       <w:pPr>
@@ -4107,7 +2673,7 @@
         </w:numPr>
       </w:pPr>
       <w:r>
-        <w:t>What was the suspect's actual shift count relative to colleagues?</w:t>
+        <w:t>Suspect's workload is substantially above average</w:t>
       </w:r>
     </w:p>
     <w:p>
@@ -4119,7 +2685,7 @@
         </w:numPr>
       </w:pPr>
       <w:r>
-        <w:t>Were incidents selected before or after the suspect was identified?</w:t>
+        <w:t>Suspect was assigned higher-acuity patients</w:t>
       </w:r>
     </w:p>
     <w:p>
@@ -4131,8 +2697,70 @@
         </w:numPr>
       </w:pPr>
       <w:r>
-        <w:t>Was patient acuity controlled for in assignments?</w:t>
-      </w:r>
+        <w:t>Selection Effect mode shows inflation from investigator bias</w:t>
+      </w:r>
+    </w:p>
+    <w:p>
+      <w:pPr>
+        <w:pStyle w:val="Heading2"/>
+      </w:pPr>
+      <w:bookmarkStart w:id="15" w:name="_Toc219298640"/>
+      <w:r>
+        <w:lastRenderedPageBreak/>
+        <w:t>3.2 The Prosecutor's Gap</w:t>
+      </w:r>
+      <w:bookmarkEnd w:id="15"/>
+    </w:p>
+    <w:p>
+      <w:r>
+        <w:t xml:space="preserve">Note the distance on the chart between the 99th percentile (amber triangle) and the maximum peak (red diamond). Prosecutors may seize upon this maximum—an outlier that occurs </w:t>
+      </w:r>
+      <w:r>
+        <w:rPr>
+          <w:i/>
+          <w:iCs/>
+        </w:rPr>
+        <w:t>naturally</w:t>
+      </w:r>
+      <w:r>
+        <w:t xml:space="preserve"> in large datasets—and present it as impossible coincidence. But someone will </w:t>
+      </w:r>
+      <w:r>
+        <w:rPr>
+          <w:i/>
+          <w:iCs/>
+        </w:rPr>
+        <w:t>always</w:t>
+      </w:r>
+      <w:r>
+        <w:t xml:space="preserve"> be the maximum. The question is whether that maximum is unusual </w:t>
+      </w:r>
+      <w:r>
+        <w:rPr>
+          <w:i/>
+          <w:iCs/>
+        </w:rPr>
+        <w:t>given their exposure</w:t>
+      </w:r>
+      <w:r>
+        <w:t>.</w:t>
+        <w:br/>
+      </w:r>
+    </w:p>
+    <w:p>
+      <w:r>
+        <w:t>The statistic selector allows you to demonstrate this gap directly: toggle from 'Mean Overlap' to 'Maximum Peak' and observe how the prosecution's argument transforms from underwhelming to apparently damning—while the underlying reality (no wrongdoing in the model) remains unchanged.</w:t>
+      </w:r>
+    </w:p>
+    <w:p>
+      <w:pPr>
+        <w:pStyle w:val="Heading2"/>
+      </w:pPr>
+      <w:bookmarkStart w:id="16" w:name="_Toc219298641"/>
+      <w:r>
+        <w:t>3.3 Key Questions for Any Case</w:t>
+      </w:r>
+      <w:bookmarkEnd w:id="16"/>
     </w:p>
     <w:p>
       <w:pPr>
@@ -4143,7 +2771,7 @@
         </w:numPr>
       </w:pPr>
       <w:r>
-        <w:t>What is the expected overlap given workload alone?</w:t>
+        <w:t>What was the suspect's actual shift count relative to colleagues?</w:t>
       </w:r>
     </w:p>
     <w:p>
@@ -4155,7 +2783,7 @@
         </w:numPr>
       </w:pPr>
       <w:r>
-        <w:t>How many nurses were examined before one was selected as suspicious?</w:t>
+        <w:t>Were incidents selected before or after the suspect was identified?</w:t>
       </w:r>
     </w:p>
     <w:p>
@@ -4167,6 +2795,42 @@
         </w:numPr>
       </w:pPr>
       <w:r>
+        <w:t>Was patient acuity controlled for in assignments?</w:t>
+      </w:r>
+    </w:p>
+    <w:p>
+      <w:pPr>
+        <w:pStyle w:val="ListParagraph"/>
+        <w:numPr>
+          <w:ilvl w:val="0"/>
+          <w:numId w:val="2"/>
+        </w:numPr>
+      </w:pPr>
+      <w:r>
+        <w:t>What is the expected overlap given workload alone?</w:t>
+      </w:r>
+    </w:p>
+    <w:p>
+      <w:pPr>
+        <w:pStyle w:val="ListParagraph"/>
+        <w:numPr>
+          <w:ilvl w:val="0"/>
+          <w:numId w:val="2"/>
+        </w:numPr>
+      </w:pPr>
+      <w:r>
+        <w:t>How many nurses were examined before one was selected as suspicious?</w:t>
+      </w:r>
+    </w:p>
+    <w:p>
+      <w:pPr>
+        <w:pStyle w:val="ListParagraph"/>
+        <w:numPr>
+          <w:ilvl w:val="0"/>
+          <w:numId w:val="2"/>
+        </w:numPr>
+      </w:pPr>
+      <w:r>
         <w:t>Is the prosecution citing a mean, a percentile, or a maximum peak—and does the argument hold for each?</w:t>
       </w:r>
     </w:p>
@@ -4192,10 +2856,7 @@
       <w:bookmarkStart w:id="17" w:name="_Toc219298642"/>
       <w:r>
         <w:lastRenderedPageBreak/>
-        <w:t xml:space="preserve">4. Incident Overlap </w:t>
-      </w:r>
-      <w:r>
-        <w:t>3D Explorer</w:t>
+        <w:t>4. Incident Overlap 3D Explorer</w:t>
       </w:r>
       <w:bookmarkEnd w:id="17"/>
     </w:p>
@@ -4227,19 +2888,7 @@
     </w:p>
     <w:p>
       <w:r>
-        <w:t xml:space="preserve">The Overlap </w:t>
-      </w:r>
-      <w:r>
-        <w:t>Explorer</w:t>
-      </w:r>
-      <w:r>
-        <w:t xml:space="preserve"> provides a complementary perspective to the Pattern Simulator. While the Pattern Simulator explores individual scenarios with specific parameters, the </w:t>
-      </w:r>
-      <w:r>
-        <w:t>Overlap Explorer</w:t>
-      </w:r>
-      <w:r>
-        <w:t xml:space="preserve"> visualises the </w:t>
+        <w:t xml:space="preserve">The Overlap Explorer provides a complementary perspective to the Pattern Simulator. While the Pattern Simulator explores individual scenarios with specific parameters, the Overlap Explorer visualises the </w:t>
       </w:r>
       <w:r>
         <w:rPr>
@@ -4249,22 +2898,18 @@
         <w:t>full statistical landscape</w:t>
       </w:r>
       <w:r>
-        <w:t> of incident-roster overlap under the null hypothesis of random incident occurrence.</w:t>
+        <w:t xml:space="preserve"> of incident-roster overlap under the null hypothesis of random incident occurrence, including separate all-shift, day-only, and night-only views when those packs are available.</w:t>
       </w:r>
     </w:p>
     <w:p/>
     <w:p>
       <w:r>
-        <w:t>This answers a broader question: across all reasonable combinations of incident count (M) and mean shift exposure (p̄</w:t>
-      </w:r>
-      <w:r>
-        <w:t xml:space="preserve">, </w:t>
-      </w:r>
-      <w:r>
-        <w:t>the average fraction of shifts worked per nurse</w:t>
-      </w:r>
-      <w:r>
-        <w:t>), what maximum overlap values should we expect by chance alone?</w:t>
+        <w:t>This answers a broader question: across all reasonable combinations of incident count (M) and mean shift exposure, what maximum overlaps and tail probabilities should we expect by chance alone?</w:t>
+      </w:r>
+    </w:p>
+    <w:p>
+      <w:r>
+        <w:t>The current explorer is therefore designed to answer both a raw-count question ("what overlaps occur?") and a rarity question ("how often would neutral staffing produce at least this much?").</w:t>
       </w:r>
     </w:p>
     <w:p>
@@ -4288,10 +2933,7 @@
     <w:p/>
     <w:p>
       <w:r>
-        <w:t>S</w:t>
-      </w:r>
-      <w:r>
-        <w:t>urfaces are generated through Monte Carlo simulation:</w:t>
+        <w:t>Surfaces are generated through Monte Carlo simulation:</w:t>
       </w:r>
     </w:p>
     <w:p>
@@ -4333,10 +2975,7 @@
         <w:t>S = 730 shifts</w:t>
       </w:r>
       <w:r>
-        <w:t> </w:t>
-      </w:r>
-      <w:r>
-        <w:t>(approximately one year of two daily shift assignments)</w:t>
+        <w:t> (approximately one year of two daily shift assignments)</w:t>
       </w:r>
     </w:p>
     <w:p>
@@ -4372,10 +3011,7 @@
         <w:t>R = 5,000 trials</w:t>
       </w:r>
       <w:r>
-        <w:t> per grid cell (880 grid cells total)</w:t>
-      </w:r>
-      <w:r>
-        <w:t xml:space="preserve">   (*)</w:t>
+        <w:t> per grid cell (880 grid cells total)   (*)</w:t>
       </w:r>
     </w:p>
     <w:p>
@@ -4393,7 +3029,7 @@
         <w:t>Workload distribution:</w:t>
       </w:r>
       <w:r>
-        <w:t> Beta(3.2, 17.25), rescaled to mean presence p̄</w:t>
+        <w:t> Beta(3.2, 17.25), rescaled to mean presence pÌ„</w:t>
       </w:r>
     </w:p>
     <w:p>
@@ -4408,12 +3044,28 @@
           <w:b/>
           <w:bCs/>
         </w:rPr>
+        <w:t>Staffing structure:</w:t>
+      </w:r>
+      <w:r>
+        <w:t xml:space="preserve"> unconstrained, fixed-headcount, or day/night stratified depending on the exported pack</w:t>
+      </w:r>
+    </w:p>
+    <w:p>
+      <w:pPr>
+        <w:numPr>
+          <w:ilvl w:val="0"/>
+          <w:numId w:val="3"/>
+        </w:numPr>
+      </w:pPr>
+      <w:r>
+        <w:rPr>
+          <w:b/>
+          <w:bCs/>
+        </w:rPr>
         <w:t>Presence clipping:</w:t>
       </w:r>
       <w:r>
         <w:t> Individual nurse presence capped at 95% of shifts</w:t>
-      </w:r>
-      <w:r>
         <w:br/>
       </w:r>
     </w:p>
@@ -4422,38 +3074,14 @@
         <w:ind w:left="720" w:hanging="360"/>
       </w:pPr>
       <w:r>
-        <w:t xml:space="preserve">(*) </w:t>
-      </w:r>
-      <w:r>
-        <w:t xml:space="preserve"> </w:t>
+        <w:t xml:space="preserve">(*)  </w:t>
       </w:r>
       <w:r>
         <w:rPr>
           <w:i/>
           <w:iCs/>
         </w:rPr>
-        <w:t>F</w:t>
-      </w:r>
-      <w:r>
-        <w:rPr>
-          <w:i/>
-          <w:iCs/>
-        </w:rPr>
-        <w:t xml:space="preserve">or efficiency, trials are </w:t>
-      </w:r>
-      <w:r>
-        <w:rPr>
-          <w:i/>
-          <w:iCs/>
-        </w:rPr>
-        <w:t xml:space="preserve">now </w:t>
-      </w:r>
-      <w:r>
-        <w:rPr>
-          <w:i/>
-          <w:iCs/>
-        </w:rPr>
-        <w:t>generated per (p̄, trial) and reused across the incident axis via prefix sampling; this keeps the per-cell distributions unchanged.</w:t>
+        <w:t>For efficiency, trials are now generated per (mean presence, trial) and reused across the incident axis via prefix sampling; this keeps the per-cell distributions unchanged. Each exported pack also stores the simulated max-overlap histogram for every grid cell so the explorer can calculate exact percentiles and tail probabilities.</w:t>
       </w:r>
     </w:p>
     <w:p>
@@ -4510,7 +3138,7 @@
           <w:b/>
           <w:bCs/>
         </w:rPr>
-        <w:t>Mean presence axis (p̄):</w:t>
+        <w:t>Mean presence axis (pÌ„):</w:t>
       </w:r>
       <w:r>
         <w:t> 0.10 to 0.40 in 11 equally-spaced intervals</w:t>
@@ -4557,7 +3185,7 @@
     <w:p/>
     <w:p>
       <w:r>
-        <w:t>Each Monte Carlo trial independently redraws nurse workloads from the beta distribution (rescaled to mean presence p̄), introducing appropriate variability into the null distribution. If ensemble_rosters=False, a single roster/workload profile is drawn per (M, p̄) grid cell and reused across all trials, modelling a fixed-roster null.</w:t>
+        <w:t>Each Monte Carlo trial redraws nurse workloads from the beta distribution unless the fixed-ward option is being used. If ensemble_rosters=False, a single ward/workload profile is held fixed across trials. Current runs can also export schema-matched combined, day-only, and night-only packs so the explorer can switch regime without changing the underlying grid.</w:t>
       </w:r>
     </w:p>
     <w:p>
@@ -4609,7 +3237,7 @@
     </w:p>
     <w:p>
       <w:r>
-        <w:t>For each grid cell (M, p̄), the simulation records the </w:t>
+        <w:t>For each grid cell (M, pÌ„), the simulation records the </w:t>
       </w:r>
       <w:r>
         <w:rPr>
@@ -5023,10 +3651,7 @@
       </w:pPr>
       <w:bookmarkStart w:id="20" w:name="_Toc219298645"/>
       <w:r>
-        <w:t xml:space="preserve">4.3 Using the 3D </w:t>
-      </w:r>
-      <w:r>
-        <w:t>Overlap Explorer</w:t>
+        <w:t>4.3 Using the 3D Overlap Explorer</w:t>
       </w:r>
       <w:bookmarkEnd w:id="20"/>
     </w:p>
@@ -5100,7 +3725,7 @@
         <w:t>Mean presence slider:</w:t>
       </w:r>
       <w:r>
-        <w:t> Set shift exposure (p̄) from 0.10 to 0.40</w:t>
+        <w:t> Set shift exposure (pÌ„) from 0.10 to 0.40</w:t>
       </w:r>
     </w:p>
     <w:p>
@@ -5118,7 +3743,7 @@
         <w:t>Intercept readout:</w:t>
       </w:r>
       <w:r>
-        <w:t> Displays interpolated Mean, Q95, Q99 values at current position</w:t>
+        <w:t xml:space="preserve"> Displays interpolated Mean, Q95, and Q99 values at the current position, with the same intercept values repeated in the M-slice profile panel</w:t>
       </w:r>
     </w:p>
     <w:p>
@@ -5129,7 +3754,43 @@
         </w:numPr>
       </w:pPr>
       <w:r>
-        <w:t>Compare observation (traffic light): Enter the observed maximum overlap for any single nurse. The indicator colour is continuous: it transitions from green at the Mean surface to orange at Q95, then from orange at Q95 to red at Q99; values above Q99 are fully red. Observed values are bounded by M (total incidents): inputs greater than M trigger a warning and are clamped to M for display. Heuristic only; not evidence of wrongdoing.</w:t>
+        <w:rPr>
+          <w:i/>
+          <w:iCs/>
+        </w:rPr>
+        <w:t>Shift regime toggle:</w:t>
+      </w:r>
+      <w:r>
+        <w:t xml:space="preserve"> Switch between All shifts, Day, and Night views using the exported regime packs. This toggle is only visible when the manifold was generated in day/night staffing mode; in unconstrained or fixed mode the toggle is hidden</w:t>
+      </w:r>
+    </w:p>
+    <w:p>
+      <w:pPr>
+        <w:numPr>
+          <w:ilvl w:val="1"/>
+          <w:numId w:val="5"/>
+        </w:numPr>
+      </w:pPr>
+      <w:r>
+        <w:rPr>
+          <w:i/>
+          <w:iCs/>
+        </w:rPr>
+        <w:t>M-slice profile mode:</w:t>
+      </w:r>
+      <w:r>
+        <w:t xml:space="preserve"> Switch the profile panel between overlap and tail-probability views for the current incident count</w:t>
+      </w:r>
+    </w:p>
+    <w:p>
+      <w:pPr>
+        <w:numPr>
+          <w:ilvl w:val="1"/>
+          <w:numId w:val="5"/>
+        </w:numPr>
+      </w:pPr>
+      <w:r>
+        <w:t>Compare observation (traffic light + rarity): Enter the observed maximum overlap for any single nurse. The indicator colour is continuous: it transitions from green at the Mean surface to orange at Q95, then from orange at Q95 to red at Q99; values above Q99 are fully red. The explorer also reports a plain-English frequency, percentile, and tail probability using the exported Monte Carlo histogram. Observed values are bounded by M (total incidents): inputs greater than M trigger a warning and are clamped to M for display. Heuristic only; not evidence of wrongdoing.</w:t>
       </w:r>
     </w:p>
     <w:p>
@@ -5160,7 +3821,7 @@
         </w:numPr>
       </w:pPr>
       <w:r>
-        <w:t>Three semi-transparent surfaces (blue = Mean, orange = Q95, green = Q99)</w:t>
+        <w:t>Three semi-transparent surfaces (blue = Mean, orange = Q95, green = Q99), with smooth animated transitions when switching regime</w:t>
       </w:r>
     </w:p>
     <w:p>
@@ -5171,7 +3832,7 @@
         </w:numPr>
       </w:pPr>
       <w:r>
-        <w:t>Floor grid showing the M × p̄ parameter space</w:t>
+        <w:t>Floor grid showing the M × pÌ„ parameter space</w:t>
       </w:r>
     </w:p>
     <w:p>
@@ -5193,7 +3854,7 @@
         </w:numPr>
       </w:pPr>
       <w:r>
-        <w:t>Coloured spheres showing where the intercept intersects each surface</w:t>
+        <w:t>Coloured spheres showing where the intercept intersects each surface, plus an observed marker when a case overlap is entered</w:t>
       </w:r>
     </w:p>
     <w:p>
@@ -5246,6 +3907,7 @@
           <w:i/>
           <w:iCs/>
         </w:rPr>
+        <w:lastRenderedPageBreak/>
         <w:t>Scroll:</w:t>
       </w:r>
       <w:r>
@@ -5290,7 +3952,7 @@
     <w:p/>
     <w:p>
       <w:r>
-        <w:t>Position the intercept at the (M, p̄) values matching a case of interest. The three surface intercepts then show:</w:t>
+        <w:t>Position the intercept at the (M, pÌ„) values matching a case of interest. The three surface intercepts then show:</w:t>
       </w:r>
     </w:p>
     <w:p/>
@@ -5323,7 +3985,6 @@
         </w:numPr>
       </w:pPr>
       <w:r>
-        <w:lastRenderedPageBreak/>
         <w:t>What maximum overlap is </w:t>
       </w:r>
       <w:r>
@@ -5371,28 +4032,18 @@
         <w:pStyle w:val="Heading2"/>
       </w:pPr>
       <w:r>
-        <w:t xml:space="preserve">4.4 Regenerating the </w:t>
-      </w:r>
-      <w:r>
-        <w:t>3D Surfaces</w:t>
+        <w:t>4.4 Regenerating the 3D Surfaces</w:t>
       </w:r>
       <w:bookmarkEnd w:id="21"/>
     </w:p>
     <w:p>
       <w:r>
-        <w:t>The Python generator (incident_overlap_</w:t>
-      </w:r>
-      <w:r>
-        <w:t>3D_</w:t>
-      </w:r>
-      <w:r>
-        <w:t xml:space="preserve">generator.py) can regenerate </w:t>
-      </w:r>
-      <w:r>
-        <w:t xml:space="preserve">surface </w:t>
-      </w:r>
-      <w:r>
-        <w:t>data with custom parameters:</w:t>
+        <w:t>The Python generator (incident_overlap_3D_generator.py) can regenerate surface data with custom parameters:</w:t>
+      </w:r>
+    </w:p>
+    <w:p>
+      <w:r>
+        <w:t>Current runs always emit the combined JSON pack. When using day/night staffing mode, day-only and night-only packs are also exported. When histogram export is enabled, each pack also contains the cell-wise max-overlap distribution used by the explorer's percentile and tail-probability readouts.</w:t>
       </w:r>
     </w:p>
     <w:p/>
@@ -5556,11 +4207,9 @@
             <w:tcW w:w="1980" w:type="dxa"/>
           </w:tcPr>
           <w:p>
-            <w:proofErr w:type="spellStart"/>
             <w:r>
               <w:t>beta_a</w:t>
             </w:r>
-            <w:proofErr w:type="spellEnd"/>
           </w:p>
         </w:tc>
         <w:tc>
@@ -5593,11 +4242,9 @@
             <w:tcW w:w="1980" w:type="dxa"/>
           </w:tcPr>
           <w:p>
-            <w:proofErr w:type="spellStart"/>
             <w:r>
               <w:t>beta_b</w:t>
             </w:r>
-            <w:proofErr w:type="spellEnd"/>
           </w:p>
         </w:tc>
         <w:tc>
@@ -5627,11 +4274,9 @@
             <w:tcW w:w="1980" w:type="dxa"/>
           </w:tcPr>
           <w:p>
-            <w:proofErr w:type="spellStart"/>
             <w:r>
               <w:t>ensemble_rosters</w:t>
             </w:r>
-            <w:proofErr w:type="spellEnd"/>
           </w:p>
         </w:tc>
         <w:tc>
@@ -5659,16 +4304,7 @@
     <w:p/>
     <w:p>
       <w:r>
-        <w:t># To generate with export</w:t>
-      </w:r>
-      <w:r>
-        <w:t xml:space="preserve"> (</w:t>
-      </w:r>
-      <w:r>
-        <w:t xml:space="preserve">alternatively </w:t>
-      </w:r>
-      <w:r>
-        <w:t>runs off a quick 3D graphic)</w:t>
+        <w:t># To generate with export (alternatively runs off a quick 3D graphic)</w:t>
       </w:r>
     </w:p>
     <w:p/>
@@ -5830,21 +4466,8 @@
           <w:numId w:val="7"/>
         </w:numPr>
       </w:pPr>
-      <w:proofErr w:type="spellStart"/>
-      <w:r>
-        <w:t>manifold_pack</w:t>
-      </w:r>
-      <w:proofErr w:type="spellEnd"/>
-      <w:r>
-        <w:t>_{mode}_R{R}_{timestamp}.</w:t>
-      </w:r>
-      <w:proofErr w:type="spellStart"/>
-      <w:r>
-        <w:t>json</w:t>
-      </w:r>
-      <w:proofErr w:type="spellEnd"/>
-      <w:r>
-        <w:t> — Compact JSON for the HTML viewer</w:t>
+      <w:r>
+        <w:t>manifold_pack_{mode}_R{R}_{timestamp}.json — Compact JSON for the HTML viewer</w:t>
       </w:r>
     </w:p>
     <w:p>
@@ -5887,21 +4510,7 @@
           <w:b/>
           <w:bCs/>
         </w:rPr>
-        <w:t xml:space="preserve">What the </w:t>
-      </w:r>
-      <w:r>
-        <w:rPr>
-          <w:b/>
-          <w:bCs/>
-        </w:rPr>
-        <w:t>3D surfaces</w:t>
-      </w:r>
-      <w:r>
-        <w:rPr>
-          <w:b/>
-          <w:bCs/>
-        </w:rPr>
-        <w:t xml:space="preserve"> show:</w:t>
+        <w:t>What the 3D surfaces show:</w:t>
       </w:r>
     </w:p>
     <w:p/>
@@ -5955,6 +4564,7 @@
         </w:numPr>
       </w:pPr>
       <w:r>
+        <w:lastRenderedPageBreak/>
         <w:t>Where in parameter space overlap values become diagnostically meaningful</w:t>
       </w:r>
     </w:p>
@@ -5978,21 +4588,7 @@
           <w:b/>
           <w:bCs/>
         </w:rPr>
-        <w:t xml:space="preserve">What the </w:t>
-      </w:r>
-      <w:r>
-        <w:rPr>
-          <w:b/>
-          <w:bCs/>
-        </w:rPr>
-        <w:t xml:space="preserve">3D surfaces </w:t>
-      </w:r>
-      <w:r>
-        <w:rPr>
-          <w:b/>
-          <w:bCs/>
-        </w:rPr>
-        <w:t>do NOT show:</w:t>
+        <w:t>What the 3D surfaces do NOT show:</w:t>
       </w:r>
     </w:p>
     <w:p/>
@@ -6052,11 +4648,7 @@
     <w:p/>
     <w:p>
       <w:r>
-        <w:t xml:space="preserve">The manifold provides statistical context, not conclusions. An observed overlap exceeding Q99 indicates the value is unusual under the null hypothesis, but does not establish </w:t>
-      </w:r>
-      <w:r>
-        <w:lastRenderedPageBreak/>
-        <w:t>causation. Conversely, an overlap within the Q95 envelope should prompt extreme caution before drawing any adverse inference.</w:t>
+        <w:t>The manifold provides statistical context, not conclusions. An observed overlap exceeding Q99 indicates the value is unusual under the null hypothesis, but does not establish causation. Conversely, an overlap within the Q95 envelope should prompt extreme caution before drawing any adverse inference.</w:t>
       </w:r>
     </w:p>
     <w:p/>
@@ -6336,13 +4928,7 @@
           </w:tcPr>
           <w:p>
             <w:r>
-              <w:t xml:space="preserve">Distributions, </w:t>
-            </w:r>
-            <w:r>
-              <w:t>empirical probabilities</w:t>
-            </w:r>
-            <w:r>
-              <w:t>, framings</w:t>
+              <w:t>Distributions, empirical probabilities, framings</w:t>
             </w:r>
           </w:p>
         </w:tc>
@@ -6538,13 +5124,7 @@
     <w:p/>
     <w:p>
       <w:r>
-        <w:t xml:space="preserve">Together, these tools enable a comprehensive statistical assessment: the </w:t>
-      </w:r>
-      <w:r>
-        <w:t>Overlap Explorer</w:t>
-      </w:r>
-      <w:r>
-        <w:t xml:space="preserve"> establishes the null landscape, while the Pattern Simulator examines specific observations within that context.</w:t>
+        <w:t>Together, these tools enable a comprehensive statistical assessment: the Overlap Explorer establishes the null landscape, while the Pattern Simulator examines specific observations within that context.</w:t>
       </w:r>
     </w:p>
     <w:p>
@@ -6595,11 +5175,7 @@
     </w:p>
     <w:p>
       <w:r>
-        <w:t xml:space="preserve">Let </w:t>
-      </w:r>
-      <w:proofErr w:type="spellStart"/>
-      <w:r>
-        <w:t>X</w:t>
+        <w:t>Let X</w:t>
       </w:r>
       <w:r>
         <w:rPr>
@@ -6607,13 +5183,8 @@
         </w:rPr>
         <w:t>n</w:t>
       </w:r>
-      <w:proofErr w:type="spellEnd"/>
-      <w:r>
-        <w:t xml:space="preserve"> denote nurse n's overlap count. Under the shift-based model: </w:t>
-      </w:r>
-      <w:proofErr w:type="spellStart"/>
-      <w:r>
-        <w:t>X</w:t>
+      <w:r>
+        <w:t xml:space="preserve"> denote nurse n's overlap count. Under the shift-based model: X</w:t>
       </w:r>
       <w:r>
         <w:rPr>
@@ -6621,13 +5192,8 @@
         </w:rPr>
         <w:t>n</w:t>
       </w:r>
-      <w:proofErr w:type="spellEnd"/>
-      <w:r>
-        <w:t xml:space="preserve"> | K, </w:t>
-      </w:r>
-      <w:proofErr w:type="spellStart"/>
-      <w:r>
-        <w:t>s</w:t>
+      <w:r>
+        <w:t xml:space="preserve"> | K, s</w:t>
       </w:r>
       <w:r>
         <w:rPr>
@@ -6635,13 +5201,8 @@
         </w:rPr>
         <w:t>n</w:t>
       </w:r>
-      <w:proofErr w:type="spellEnd"/>
-      <w:r>
-        <w:t xml:space="preserve">, S ~ Hypergeometric(S, </w:t>
-      </w:r>
-      <w:proofErr w:type="spellStart"/>
-      <w:r>
-        <w:t>s</w:t>
+      <w:r>
+        <w:t>, S ~ Hypergeometric(S, s</w:t>
       </w:r>
       <w:r>
         <w:rPr>
@@ -6649,13 +5210,8 @@
         </w:rPr>
         <w:t>n</w:t>
       </w:r>
-      <w:proofErr w:type="spellEnd"/>
-      <w:r>
-        <w:t xml:space="preserve">, K), where S = 730 total shifts, </w:t>
-      </w:r>
-      <w:proofErr w:type="spellStart"/>
-      <w:r>
-        <w:t>s</w:t>
+      <w:r>
+        <w:t>, K), where S = 730 total shifts, s</w:t>
       </w:r>
       <w:r>
         <w:rPr>
@@ -6663,13 +5219,8 @@
         </w:rPr>
         <w:t>n</w:t>
       </w:r>
-      <w:proofErr w:type="spellEnd"/>
-      <w:r>
-        <w:t xml:space="preserve"> = nurse n's shifts, K = incident count. The Beta-binomial framework treats </w:t>
-      </w:r>
-      <w:proofErr w:type="spellStart"/>
-      <w:r>
-        <w:t>s</w:t>
+      <w:r>
+        <w:t xml:space="preserve"> = nurse n's shifts, K = incident count. The Beta-binomial framework treats s</w:t>
       </w:r>
       <w:r>
         <w:rPr>
@@ -6677,13 +5228,8 @@
         </w:rPr>
         <w:t>n</w:t>
       </w:r>
-      <w:proofErr w:type="spellEnd"/>
-      <w:r>
-        <w:t xml:space="preserve"> ~ Binomial(S, </w:t>
-      </w:r>
-      <w:proofErr w:type="spellStart"/>
-      <w:r>
-        <w:t>p</w:t>
+      <w:r>
+        <w:t xml:space="preserve"> ~ Binomial(S, p</w:t>
       </w:r>
       <w:r>
         <w:rPr>
@@ -6691,13 +5237,8 @@
         </w:rPr>
         <w:t>n</w:t>
       </w:r>
-      <w:proofErr w:type="spellEnd"/>
-      <w:r>
-        <w:t xml:space="preserve">) where </w:t>
-      </w:r>
-      <w:proofErr w:type="spellStart"/>
-      <w:r>
-        <w:t>p</w:t>
+      <w:r>
+        <w:t>) where p</w:t>
       </w:r>
       <w:r>
         <w:rPr>
@@ -6705,25 +5246,13 @@
         </w:rPr>
         <w:t>n</w:t>
       </w:r>
-      <w:proofErr w:type="spellEnd"/>
-      <w:r>
-        <w:t xml:space="preserve"> ~ Beta(α, β). </w:t>
-      </w:r>
-      <w:proofErr w:type="spellStart"/>
-      <w:r>
-        <w:t>Reparameterised</w:t>
-      </w:r>
-      <w:proofErr w:type="spellEnd"/>
-      <w:r>
-        <w:t xml:space="preserve">: μ = α/(α+β), κ = α+β, giving α = </w:t>
-      </w:r>
-      <w:proofErr w:type="spellStart"/>
-      <w:r>
-        <w:t>μκ</w:t>
-      </w:r>
-      <w:proofErr w:type="spellEnd"/>
-      <w:r>
-        <w:t>, β = (1−μ)κ.</w:t>
+      <w:r>
+        <w:t xml:space="preserve"> ~ Beta(α, β). Reparameterised: μ = α/(α+β), κ = α+β, giving α = μκ, β = (1−μ)κ.</w:t>
+      </w:r>
+    </w:p>
+    <w:p>
+      <w:r>
+        <w:t>In the fixed and day/night staffing modes, the simulator first builds a full shift-assignment matrix by weighted sampling without replacement. Day and night regime packs therefore represent separate constrained null distributions rather than a single homogenised beta-binomial process.</w:t>
       </w:r>
     </w:p>
     <w:p>
@@ -6757,7 +5286,7 @@
         </w:numPr>
       </w:pPr>
       <w:r>
-        <w:t>Nurse schedules are independent draws from the workload distribution</w:t>
+        <w:t>Unconstrained mode treats nurse schedules as independent workload draws; fixed and day/night modes instead impose exact shift headcounts via weighted sampling without replacement</w:t>
       </w:r>
     </w:p>
     <w:p>
@@ -6769,7 +5298,7 @@
         </w:numPr>
       </w:pPr>
       <w:r>
-        <w:t>Does not model shift-to-shift dependencies or scheduling constraints</w:t>
+        <w:t>Still does not model full rota rules such as leave, skill mix, consecutive-night blocks, or other hospital scheduling constraints</w:t>
       </w:r>
     </w:p>
     <w:p>
@@ -6781,7 +5310,7 @@
         </w:numPr>
       </w:pPr>
       <w:r>
-        <w:t>Acuity confounding is simplified to a multiplicative probability adjustment</w:t>
+        <w:t>Day/night stratification is simplified to two staffing regimes rather than a full historical rota reconstruction</w:t>
       </w:r>
     </w:p>
     <w:p>
@@ -6793,18 +5322,8 @@
         </w:numPr>
       </w:pPr>
       <w:r>
-        <w:t>730 shifts = 365 days × 2 shifts/day (day/night); adjust for different ward structures</w:t>
-      </w:r>
-    </w:p>
-    <w:p>
-      <w:pPr>
-        <w:pStyle w:val="Heading2"/>
-      </w:pPr>
-      <w:bookmarkStart w:id="27" w:name="_Toc219298652"/>
-      <w:r>
-        <w:t>5.3 References</w:t>
-      </w:r>
-      <w:bookmarkEnd w:id="27"/>
+        <w:t>Acuity confounding is simplified to a multiplicative probability adjustment</w:t>
+      </w:r>
     </w:p>
     <w:p>
       <w:pPr>
@@ -6815,31 +5334,29 @@
         </w:numPr>
       </w:pPr>
       <w:r>
-        <w:t>O'Quigley, J. (2025). 'Use of roster charts in the investigation and prosecution of nurses suspected of inflicting deliberate harm on patients.' Medicine, Science and the Law. —</w:t>
-      </w:r>
-      <w:r>
-        <w:t xml:space="preserve"> Beta </w:t>
-      </w:r>
-      <w:r>
-        <w:t>distribution parameters</w:t>
-      </w:r>
-      <w:r>
-        <w:t xml:space="preserve"> </w:t>
-      </w:r>
-      <w:r>
-        <w:t xml:space="preserve">of </w:t>
-      </w:r>
-      <w:r>
-        <w:t xml:space="preserve">(3.2, 17.25) </w:t>
-      </w:r>
-      <w:r>
-        <w:t xml:space="preserve">are an </w:t>
-      </w:r>
-      <w:r>
-        <w:t>estimate from this paper</w:t>
-      </w:r>
-      <w:r>
-        <w:t>.</w:t>
+        <w:t>730 shifts = 365 days × 2 shifts/day (day/night); adjust for different ward structures</w:t>
+      </w:r>
+    </w:p>
+    <w:p>
+      <w:pPr>
+        <w:pStyle w:val="Heading2"/>
+      </w:pPr>
+      <w:bookmarkStart w:id="27" w:name="_Toc219298652"/>
+      <w:r>
+        <w:t>5.3 References</w:t>
+      </w:r>
+      <w:bookmarkEnd w:id="27"/>
+    </w:p>
+    <w:p>
+      <w:pPr>
+        <w:pStyle w:val="ListParagraph"/>
+        <w:numPr>
+          <w:ilvl w:val="0"/>
+          <w:numId w:val="2"/>
+        </w:numPr>
+      </w:pPr>
+      <w:r>
+        <w:t>O'Quigley, J. (2025). 'Use of roster charts in the investigation and prosecution of nurses suspected of inflicting deliberate harm on patients.' Medicine, Science and the Law. — Beta distribution parameters of (3.2, 17.25) are an estimate from this paper.</w:t>
       </w:r>
     </w:p>
     <w:p>

</xml_diff>